<commit_message>
Update reports: sample-style cover and index, faculty name, signatures, mentor details
Co-Authored-By: Claude Opus 5.5 <noreply@anthropic.com>
</commit_message>
<xml_diff>
--- a/Report2_Supporting_Documents_Ishan_08514803123.docx
+++ b/Report2_Supporting_Documents_Ishan_08514803123.docx
@@ -248,7 +248,7 @@
           <w:i/>
           <w:sz w:val="26"/>
         </w:rPr>
-        <w:t>______________________</w:t>
+        <w:t>Sunil Maggu</w:t>
       </w:r>
     </w:p>
     <w:p>
@@ -918,7 +918,7 @@
           <w:b w:val="false"/>
           <w:sz w:val="18"/>
         </w:rPr>
-        <w:t>Faculty Counsellor: ______________________________   Track: Industrial Internship</w:t>
+        <w:t>Faculty Counsellor: Sunil Maggu   Track: Industrial Internship</w:t>
       </w:r>
     </w:p>
     <w:p>
@@ -1846,53 +1846,18 @@
       </w:pPr>
       <w:r>
         <w:rPr>
-          <w:rFonts w:eastAsia="Times New Roman"/>
           <w:b/>
           <w:sz w:val="15"/>
         </w:rPr>
-        <w:t>Student Signature: ____________________   Date: 12 October 2026     Faculty Counsellor Verification: ____________________   Date: __________</w:t>
-      </w:r>
-    </w:p>
-    <w:p>
-      <w:pPr>
-        <w:pStyle w:val="Heading1"/>
-        <w:rPr/>
-      </w:pPr>
-      <w:r>
-        <w:rPr/>
-        <w:t>2. OFFER / INTERNSHIP AGREEMENT</w:t>
-      </w:r>
-    </w:p>
-    <w:p>
-      <w:pPr>
-        <w:pStyle w:val="Normal"/>
-        <w:spacing w:before="0" w:after="40"/>
-        <w:jc w:val="center"/>
-        <w:rPr/>
-      </w:pPr>
-      <w:r>
-        <w:rPr>
-          <w:b w:val="false"/>
-          <w:i/>
-          <w:sz w:val="21"/>
-        </w:rPr>
-        <w:t>Internship Agreement between PV Doctor Pte. Ltd. and Ishan Bhattacharya, dated 4 May 2026 (6 pages). The personal identification number on page 2 has been masked.</w:t>
-      </w:r>
-    </w:p>
-    <w:p>
-      <w:pPr>
-        <w:pStyle w:val="Normal"/>
-        <w:spacing w:lineRule="auto" w:line="240"/>
-        <w:jc w:val="center"/>
-        <w:rPr/>
-      </w:pPr>
+        <w:t xml:space="preserve">Student Signature: </w:t>
+      </w:r>
       <w:r>
         <w:rPr/>
         <w:drawing>
           <wp:inline distT="0" distB="0" distL="0" distR="0">
-            <wp:extent cx="5255895" cy="7432675"/>
+            <wp:extent cx="1315720" cy="161925"/>
             <wp:effectExtent l="0" t="0" r="0" b="0"/>
-            <wp:docPr id="2" name="Picture 2"/>
+            <wp:docPr id="2" name="Image2"/>
             <wp:cNvGraphicFramePr>
               <a:graphicFrameLocks xmlns:a="http://schemas.openxmlformats.org/drawingml/2006/main" noChangeAspect="1"/>
             </wp:cNvGraphicFramePr>
@@ -1900,7 +1865,7 @@
               <a:graphicData uri="http://schemas.openxmlformats.org/drawingml/2006/picture">
                 <pic:pic xmlns:pic="http://schemas.openxmlformats.org/drawingml/2006/picture">
                   <pic:nvPicPr>
-                    <pic:cNvPr id="2" name="Picture 2"/>
+                    <pic:cNvPr id="2" name="Image2"/>
                     <pic:cNvPicPr>
                       <a:picLocks noChangeAspect="1" noChangeArrowheads="1"/>
                     </pic:cNvPicPr>
@@ -1914,7 +1879,7 @@
                   <pic:spPr bwMode="auto">
                     <a:xfrm>
                       <a:off x="0" y="0"/>
-                      <a:ext cx="5255895" cy="7432675"/>
+                      <a:ext cx="1315720" cy="161925"/>
                     </a:xfrm>
                     <a:prstGeom prst="rect">
                       <a:avLst/>
@@ -1927,23 +1892,44 @@
           </wp:inline>
         </w:drawing>
       </w:r>
-    </w:p>
-    <w:p>
-      <w:pPr>
-        <w:pStyle w:val="Normal"/>
-        <w:rPr/>
-      </w:pPr>
-      <w:r>
-        <w:rPr/>
-      </w:r>
-      <w:r>
-        <w:br w:type="page"/>
-      </w:r>
-    </w:p>
-    <w:p>
-      <w:pPr>
-        <w:pStyle w:val="Normal"/>
-        <w:spacing w:lineRule="auto" w:line="240" w:before="0" w:after="160"/>
+      <w:r>
+        <w:rPr>
+          <w:b/>
+          <w:sz w:val="15"/>
+        </w:rPr>
+        <w:t xml:space="preserve">   Date: 12 October 2026     Faculty Counsellor Verification: ____________________   Date: __________</w:t>
+      </w:r>
+    </w:p>
+    <w:p>
+      <w:pPr>
+        <w:pStyle w:val="Heading1"/>
+        <w:rPr/>
+      </w:pPr>
+      <w:r>
+        <w:rPr/>
+        <w:t>2. OFFER / INTERNSHIP AGREEMENT</w:t>
+      </w:r>
+    </w:p>
+    <w:p>
+      <w:pPr>
+        <w:pStyle w:val="Normal"/>
+        <w:spacing w:before="0" w:after="40"/>
+        <w:jc w:val="center"/>
+        <w:rPr/>
+      </w:pPr>
+      <w:r>
+        <w:rPr>
+          <w:b w:val="false"/>
+          <w:i/>
+          <w:sz w:val="21"/>
+        </w:rPr>
+        <w:t>Internship Agreement between PV Doctor Pte. Ltd. and Ishan Bhattacharya, dated 4 May 2026 (6 pages). The personal identification number on page 2 has been masked.</w:t>
+      </w:r>
+    </w:p>
+    <w:p>
+      <w:pPr>
+        <w:pStyle w:val="Normal"/>
+        <w:spacing w:lineRule="auto" w:line="240"/>
         <w:jc w:val="center"/>
         <w:rPr/>
       </w:pPr>
@@ -1951,7 +1937,7 @@
         <w:rPr/>
         <w:drawing>
           <wp:inline distT="0" distB="0" distL="0" distR="0">
-            <wp:extent cx="5507990" cy="7788910"/>
+            <wp:extent cx="5255895" cy="7432675"/>
             <wp:effectExtent l="0" t="0" r="0" b="0"/>
             <wp:docPr id="3" name="Picture 3"/>
             <wp:cNvGraphicFramePr>
@@ -1975,7 +1961,7 @@
                   <pic:spPr bwMode="auto">
                     <a:xfrm>
                       <a:off x="0" y="0"/>
-                      <a:ext cx="5507990" cy="7788910"/>
+                      <a:ext cx="5255895" cy="7432675"/>
                     </a:xfrm>
                     <a:prstGeom prst="rect">
                       <a:avLst/>
@@ -2235,18 +2221,20 @@
     </w:p>
     <w:p>
       <w:pPr>
-        <w:pStyle w:val="Heading1"/>
-        <w:rPr/>
-      </w:pPr>
-      <w:r>
-        <w:rPr/>
-        <w:t>3. INTERNSHIP COMPLETION CERTIFICATE</w:t>
-      </w:r>
-    </w:p>
-    <w:p>
-      <w:pPr>
-        <w:pStyle w:val="Normal"/>
-        <w:spacing w:lineRule="auto" w:line="240"/>
+        <w:pStyle w:val="Normal"/>
+        <w:rPr/>
+      </w:pPr>
+      <w:r>
+        <w:rPr/>
+      </w:r>
+      <w:r>
+        <w:br w:type="page"/>
+      </w:r>
+    </w:p>
+    <w:p>
+      <w:pPr>
+        <w:pStyle w:val="Normal"/>
+        <w:spacing w:lineRule="auto" w:line="240" w:before="0" w:after="160"/>
         <w:jc w:val="center"/>
         <w:rPr/>
       </w:pPr>
@@ -2299,6 +2287,65 @@
       </w:pPr>
       <w:r>
         <w:rPr/>
+        <w:t>3. INTERNSHIP COMPLETION CERTIFICATE</w:t>
+      </w:r>
+    </w:p>
+    <w:p>
+      <w:pPr>
+        <w:pStyle w:val="Normal"/>
+        <w:spacing w:lineRule="auto" w:line="240"/>
+        <w:jc w:val="center"/>
+        <w:rPr/>
+      </w:pPr>
+      <w:r>
+        <w:rPr/>
+        <w:drawing>
+          <wp:inline distT="0" distB="0" distL="0" distR="0">
+            <wp:extent cx="5507990" cy="7788910"/>
+            <wp:effectExtent l="0" t="0" r="0" b="0"/>
+            <wp:docPr id="9" name="Picture 9"/>
+            <wp:cNvGraphicFramePr>
+              <a:graphicFrameLocks xmlns:a="http://schemas.openxmlformats.org/drawingml/2006/main" noChangeAspect="1"/>
+            </wp:cNvGraphicFramePr>
+            <a:graphic xmlns:a="http://schemas.openxmlformats.org/drawingml/2006/main">
+              <a:graphicData uri="http://schemas.openxmlformats.org/drawingml/2006/picture">
+                <pic:pic xmlns:pic="http://schemas.openxmlformats.org/drawingml/2006/picture">
+                  <pic:nvPicPr>
+                    <pic:cNvPr id="9" name="Picture 9"/>
+                    <pic:cNvPicPr>
+                      <a:picLocks noChangeAspect="1" noChangeArrowheads="1"/>
+                    </pic:cNvPicPr>
+                  </pic:nvPicPr>
+                  <pic:blipFill>
+                    <a:blip r:embed="rId13"/>
+                    <a:stretch>
+                      <a:fillRect/>
+                    </a:stretch>
+                  </pic:blipFill>
+                  <pic:spPr bwMode="auto">
+                    <a:xfrm>
+                      <a:off x="0" y="0"/>
+                      <a:ext cx="5507990" cy="7788910"/>
+                    </a:xfrm>
+                    <a:prstGeom prst="rect">
+                      <a:avLst/>
+                    </a:prstGeom>
+                    <a:noFill/>
+                  </pic:spPr>
+                </pic:pic>
+              </a:graphicData>
+            </a:graphic>
+          </wp:inline>
+        </w:drawing>
+      </w:r>
+    </w:p>
+    <w:p>
+      <w:pPr>
+        <w:pStyle w:val="Heading1"/>
+        <w:rPr/>
+      </w:pPr>
+      <w:r>
+        <w:rPr/>
         <w:t>4. NOC STATUS NOTE</w:t>
       </w:r>
     </w:p>
@@ -2490,21 +2537,44 @@
       </w:pPr>
       <w:r>
         <w:rPr/>
-      </w:r>
-    </w:p>
-    <w:p>
-      <w:pPr>
-        <w:pStyle w:val="Normal"/>
-        <w:spacing w:before="0" w:after="40"/>
-        <w:jc w:val="left"/>
-        <w:rPr/>
-      </w:pPr>
-      <w:r>
-        <w:rPr>
-          <w:b w:val="false"/>
-          <w:i w:val="false"/>
-        </w:rPr>
-        <w:t>______________________________</w:t>
+        <w:drawing>
+          <wp:inline distT="0" distB="0" distL="0" distR="0">
+            <wp:extent cx="2630805" cy="323850"/>
+            <wp:effectExtent l="0" t="0" r="0" b="0"/>
+            <wp:docPr id="10" name="Picture 10"/>
+            <wp:cNvGraphicFramePr>
+              <a:graphicFrameLocks xmlns:a="http://schemas.openxmlformats.org/drawingml/2006/main" noChangeAspect="1"/>
+            </wp:cNvGraphicFramePr>
+            <a:graphic xmlns:a="http://schemas.openxmlformats.org/drawingml/2006/main">
+              <a:graphicData uri="http://schemas.openxmlformats.org/drawingml/2006/picture">
+                <pic:pic xmlns:pic="http://schemas.openxmlformats.org/drawingml/2006/picture">
+                  <pic:nvPicPr>
+                    <pic:cNvPr id="10" name="Picture 10"/>
+                    <pic:cNvPicPr>
+                      <a:picLocks noChangeAspect="1" noChangeArrowheads="1"/>
+                    </pic:cNvPicPr>
+                  </pic:nvPicPr>
+                  <pic:blipFill>
+                    <a:blip r:embed="rId14"/>
+                    <a:stretch>
+                      <a:fillRect/>
+                    </a:stretch>
+                  </pic:blipFill>
+                  <pic:spPr bwMode="auto">
+                    <a:xfrm>
+                      <a:off x="0" y="0"/>
+                      <a:ext cx="2630805" cy="323850"/>
+                    </a:xfrm>
+                    <a:prstGeom prst="rect">
+                      <a:avLst/>
+                    </a:prstGeom>
+                    <a:noFill/>
+                  </pic:spPr>
+                </pic:pic>
+              </a:graphicData>
+            </a:graphic>
+          </wp:inline>
+        </w:drawing>
       </w:r>
     </w:p>
     <w:p>
@@ -3379,7 +3449,48 @@
           <w:b w:val="false"/>
           <w:i w:val="false"/>
         </w:rPr>
-        <w:t>Signature of Student: ______________________________</w:t>
+        <w:t xml:space="preserve">Signature of Student: </w:t>
+      </w:r>
+      <w:r>
+        <w:rPr/>
+        <w:drawing>
+          <wp:inline distT="0" distB="0" distL="0" distR="0">
+            <wp:extent cx="2338705" cy="288290"/>
+            <wp:effectExtent l="0" t="0" r="0" b="0"/>
+            <wp:docPr id="11" name="Picture 11"/>
+            <wp:cNvGraphicFramePr>
+              <a:graphicFrameLocks xmlns:a="http://schemas.openxmlformats.org/drawingml/2006/main" noChangeAspect="1"/>
+            </wp:cNvGraphicFramePr>
+            <a:graphic xmlns:a="http://schemas.openxmlformats.org/drawingml/2006/main">
+              <a:graphicData uri="http://schemas.openxmlformats.org/drawingml/2006/picture">
+                <pic:pic xmlns:pic="http://schemas.openxmlformats.org/drawingml/2006/picture">
+                  <pic:nvPicPr>
+                    <pic:cNvPr id="11" name="Picture 11"/>
+                    <pic:cNvPicPr>
+                      <a:picLocks noChangeAspect="1" noChangeArrowheads="1"/>
+                    </pic:cNvPicPr>
+                  </pic:nvPicPr>
+                  <pic:blipFill>
+                    <a:blip r:embed="rId15"/>
+                    <a:stretch>
+                      <a:fillRect/>
+                    </a:stretch>
+                  </pic:blipFill>
+                  <pic:spPr bwMode="auto">
+                    <a:xfrm>
+                      <a:off x="0" y="0"/>
+                      <a:ext cx="2338705" cy="288290"/>
+                    </a:xfrm>
+                    <a:prstGeom prst="rect">
+                      <a:avLst/>
+                    </a:prstGeom>
+                    <a:noFill/>
+                  </pic:spPr>
+                </pic:pic>
+              </a:graphicData>
+            </a:graphic>
+          </wp:inline>
+        </w:drawing>
       </w:r>
     </w:p>
     <w:p>
@@ -3504,7 +3615,7 @@
           <w:b w:val="false"/>
           <w:i w:val="false"/>
         </w:rPr>
-        <w:t>Industry Mentor / Research Supervisor            Faculty Counsellor</w:t>
+        <w:t>Industry Mentor (Mr. Manav Gupta)            Faculty Counsellor (Sunil Maggu)</w:t>
       </w:r>
     </w:p>
     <w:p>
@@ -8609,258 +8720,6 @@
           <wp:inline distT="0" distB="0" distL="0" distR="0">
             <wp:extent cx="5579745" cy="5057140"/>
             <wp:effectExtent l="0" t="0" r="0" b="0"/>
-            <wp:docPr id="9" name="Picture 9"/>
-            <wp:cNvGraphicFramePr>
-              <a:graphicFrameLocks xmlns:a="http://schemas.openxmlformats.org/drawingml/2006/main" noChangeAspect="1"/>
-            </wp:cNvGraphicFramePr>
-            <a:graphic xmlns:a="http://schemas.openxmlformats.org/drawingml/2006/main">
-              <a:graphicData uri="http://schemas.openxmlformats.org/drawingml/2006/picture">
-                <pic:pic xmlns:pic="http://schemas.openxmlformats.org/drawingml/2006/picture">
-                  <pic:nvPicPr>
-                    <pic:cNvPr id="9" name="Picture 9"/>
-                    <pic:cNvPicPr>
-                      <a:picLocks noChangeAspect="1" noChangeArrowheads="1"/>
-                    </pic:cNvPicPr>
-                  </pic:nvPicPr>
-                  <pic:blipFill>
-                    <a:blip r:embed="rId13"/>
-                    <a:stretch>
-                      <a:fillRect/>
-                    </a:stretch>
-                  </pic:blipFill>
-                  <pic:spPr bwMode="auto">
-                    <a:xfrm>
-                      <a:off x="0" y="0"/>
-                      <a:ext cx="5579745" cy="5057140"/>
-                    </a:xfrm>
-                    <a:prstGeom prst="rect">
-                      <a:avLst/>
-                    </a:prstGeom>
-                    <a:noFill/>
-                  </pic:spPr>
-                </pic:pic>
-              </a:graphicData>
-            </a:graphic>
-          </wp:inline>
-        </w:drawing>
-      </w:r>
-    </w:p>
-    <w:p>
-      <w:pPr>
-        <w:pStyle w:val="Caption"/>
-        <w:rPr/>
-      </w:pPr>
-      <w:r>
-        <w:rPr/>
-        <w:t xml:space="preserve">Figure </w:t>
-      </w:r>
-      <w:r>
-        <w:rPr/>
-        <w:fldChar w:fldCharType="begin"/>
-      </w:r>
-      <w:r>
-        <w:rPr/>
-        <w:instrText xml:space="preserve"> SEQ Figure \* ARABIC </w:instrText>
-      </w:r>
-      <w:r>
-        <w:rPr/>
-        <w:fldChar w:fldCharType="separate"/>
-      </w:r>
-      <w:r>
-        <w:rPr/>
-        <w:t>1</w:t>
-      </w:r>
-      <w:r>
-        <w:rPr/>
-        <w:fldChar w:fldCharType="end"/>
-      </w:r>
-      <w:r>
-        <w:rPr/>
-        <w:t>: Portfolio Overview</w:t>
-      </w:r>
-    </w:p>
-    <w:p>
-      <w:pPr>
-        <w:pStyle w:val="Normal"/>
-        <w:keepNext w:val="true"/>
-        <w:spacing w:lineRule="auto" w:line="240"/>
-        <w:jc w:val="center"/>
-        <w:rPr/>
-      </w:pPr>
-      <w:r>
-        <w:rPr/>
-        <w:drawing>
-          <wp:inline distT="0" distB="0" distL="0" distR="0">
-            <wp:extent cx="5579745" cy="1377315"/>
-            <wp:effectExtent l="0" t="0" r="0" b="0"/>
-            <wp:docPr id="10" name="Picture 10"/>
-            <wp:cNvGraphicFramePr>
-              <a:graphicFrameLocks xmlns:a="http://schemas.openxmlformats.org/drawingml/2006/main" noChangeAspect="1"/>
-            </wp:cNvGraphicFramePr>
-            <a:graphic xmlns:a="http://schemas.openxmlformats.org/drawingml/2006/main">
-              <a:graphicData uri="http://schemas.openxmlformats.org/drawingml/2006/picture">
-                <pic:pic xmlns:pic="http://schemas.openxmlformats.org/drawingml/2006/picture">
-                  <pic:nvPicPr>
-                    <pic:cNvPr id="10" name="Picture 10"/>
-                    <pic:cNvPicPr>
-                      <a:picLocks noChangeAspect="1" noChangeArrowheads="1"/>
-                    </pic:cNvPicPr>
-                  </pic:nvPicPr>
-                  <pic:blipFill>
-                    <a:blip r:embed="rId14"/>
-                    <a:stretch>
-                      <a:fillRect/>
-                    </a:stretch>
-                  </pic:blipFill>
-                  <pic:spPr bwMode="auto">
-                    <a:xfrm>
-                      <a:off x="0" y="0"/>
-                      <a:ext cx="5579745" cy="1377315"/>
-                    </a:xfrm>
-                    <a:prstGeom prst="rect">
-                      <a:avLst/>
-                    </a:prstGeom>
-                    <a:noFill/>
-                  </pic:spPr>
-                </pic:pic>
-              </a:graphicData>
-            </a:graphic>
-          </wp:inline>
-        </w:drawing>
-      </w:r>
-    </w:p>
-    <w:p>
-      <w:pPr>
-        <w:pStyle w:val="Caption"/>
-        <w:rPr/>
-      </w:pPr>
-      <w:r>
-        <w:rPr/>
-        <w:t xml:space="preserve">Figure </w:t>
-      </w:r>
-      <w:r>
-        <w:rPr/>
-        <w:fldChar w:fldCharType="begin"/>
-      </w:r>
-      <w:r>
-        <w:rPr/>
-        <w:instrText xml:space="preserve"> SEQ Figure \* ARABIC </w:instrText>
-      </w:r>
-      <w:r>
-        <w:rPr/>
-        <w:fldChar w:fldCharType="separate"/>
-      </w:r>
-      <w:r>
-        <w:rPr/>
-        <w:t>2</w:t>
-      </w:r>
-      <w:r>
-        <w:rPr/>
-        <w:fldChar w:fldCharType="end"/>
-      </w:r>
-      <w:r>
-        <w:rPr/>
-        <w:t>: Performance Ratio Evolution with corridor</w:t>
-      </w:r>
-    </w:p>
-    <w:p>
-      <w:pPr>
-        <w:pStyle w:val="Normal"/>
-        <w:keepNext w:val="true"/>
-        <w:spacing w:lineRule="auto" w:line="240"/>
-        <w:jc w:val="center"/>
-        <w:rPr/>
-      </w:pPr>
-      <w:r>
-        <w:rPr/>
-        <w:drawing>
-          <wp:inline distT="0" distB="0" distL="0" distR="0">
-            <wp:extent cx="5579745" cy="2771775"/>
-            <wp:effectExtent l="0" t="0" r="0" b="0"/>
-            <wp:docPr id="11" name="Picture 11"/>
-            <wp:cNvGraphicFramePr>
-              <a:graphicFrameLocks xmlns:a="http://schemas.openxmlformats.org/drawingml/2006/main" noChangeAspect="1"/>
-            </wp:cNvGraphicFramePr>
-            <a:graphic xmlns:a="http://schemas.openxmlformats.org/drawingml/2006/main">
-              <a:graphicData uri="http://schemas.openxmlformats.org/drawingml/2006/picture">
-                <pic:pic xmlns:pic="http://schemas.openxmlformats.org/drawingml/2006/picture">
-                  <pic:nvPicPr>
-                    <pic:cNvPr id="11" name="Picture 11"/>
-                    <pic:cNvPicPr>
-                      <a:picLocks noChangeAspect="1" noChangeArrowheads="1"/>
-                    </pic:cNvPicPr>
-                  </pic:nvPicPr>
-                  <pic:blipFill>
-                    <a:blip r:embed="rId15"/>
-                    <a:stretch>
-                      <a:fillRect/>
-                    </a:stretch>
-                  </pic:blipFill>
-                  <pic:spPr bwMode="auto">
-                    <a:xfrm>
-                      <a:off x="0" y="0"/>
-                      <a:ext cx="5579745" cy="2771775"/>
-                    </a:xfrm>
-                    <a:prstGeom prst="rect">
-                      <a:avLst/>
-                    </a:prstGeom>
-                    <a:noFill/>
-                  </pic:spPr>
-                </pic:pic>
-              </a:graphicData>
-            </a:graphic>
-          </wp:inline>
-        </w:drawing>
-      </w:r>
-    </w:p>
-    <w:p>
-      <w:pPr>
-        <w:pStyle w:val="Caption"/>
-        <w:rPr/>
-      </w:pPr>
-      <w:r>
-        <w:rPr/>
-        <w:t xml:space="preserve">Figure </w:t>
-      </w:r>
-      <w:r>
-        <w:rPr/>
-        <w:fldChar w:fldCharType="begin"/>
-      </w:r>
-      <w:r>
-        <w:rPr/>
-        <w:instrText xml:space="preserve"> SEQ Figure \* ARABIC </w:instrText>
-      </w:r>
-      <w:r>
-        <w:rPr/>
-        <w:fldChar w:fldCharType="separate"/>
-      </w:r>
-      <w:r>
-        <w:rPr/>
-        <w:t>3</w:t>
-      </w:r>
-      <w:r>
-        <w:rPr/>
-        <w:fldChar w:fldCharType="end"/>
-      </w:r>
-      <w:r>
-        <w:rPr/>
-        <w:t>: Irradiation vs Yield</w:t>
-      </w:r>
-    </w:p>
-    <w:p>
-      <w:pPr>
-        <w:pStyle w:val="Normal"/>
-        <w:keepNext w:val="true"/>
-        <w:spacing w:lineRule="auto" w:line="240"/>
-        <w:jc w:val="center"/>
-        <w:rPr/>
-      </w:pPr>
-      <w:r>
-        <w:rPr/>
-        <w:drawing>
-          <wp:inline distT="0" distB="0" distL="0" distR="0">
-            <wp:extent cx="5579745" cy="2771775"/>
-            <wp:effectExtent l="0" t="0" r="0" b="0"/>
             <wp:docPr id="12" name="Picture 12"/>
             <wp:cNvGraphicFramePr>
               <a:graphicFrameLocks xmlns:a="http://schemas.openxmlformats.org/drawingml/2006/main" noChangeAspect="1"/>
@@ -8883,7 +8742,7 @@
                   <pic:spPr bwMode="auto">
                     <a:xfrm>
                       <a:off x="0" y="0"/>
-                      <a:ext cx="5579745" cy="2771775"/>
+                      <a:ext cx="5579745" cy="5057140"/>
                     </a:xfrm>
                     <a:prstGeom prst="rect">
                       <a:avLst/>
@@ -8920,7 +8779,7 @@
       </w:r>
       <w:r>
         <w:rPr/>
-        <w:t>4</w:t>
+        <w:t>1</w:t>
       </w:r>
       <w:r>
         <w:rPr/>
@@ -8928,7 +8787,7 @@
       </w:r>
       <w:r>
         <w:rPr/>
-        <w:t>: Inverter Performance Heatmap</w:t>
+        <w:t>: Portfolio Overview</w:t>
       </w:r>
     </w:p>
     <w:p>
@@ -8943,7 +8802,7 @@
         <w:rPr/>
         <w:drawing>
           <wp:inline distT="0" distB="0" distL="0" distR="0">
-            <wp:extent cx="5579745" cy="2665095"/>
+            <wp:extent cx="5579745" cy="1377315"/>
             <wp:effectExtent l="0" t="0" r="0" b="0"/>
             <wp:docPr id="13" name="Picture 13"/>
             <wp:cNvGraphicFramePr>
@@ -8967,6 +8826,258 @@
                   <pic:spPr bwMode="auto">
                     <a:xfrm>
                       <a:off x="0" y="0"/>
+                      <a:ext cx="5579745" cy="1377315"/>
+                    </a:xfrm>
+                    <a:prstGeom prst="rect">
+                      <a:avLst/>
+                    </a:prstGeom>
+                    <a:noFill/>
+                  </pic:spPr>
+                </pic:pic>
+              </a:graphicData>
+            </a:graphic>
+          </wp:inline>
+        </w:drawing>
+      </w:r>
+    </w:p>
+    <w:p>
+      <w:pPr>
+        <w:pStyle w:val="Caption"/>
+        <w:rPr/>
+      </w:pPr>
+      <w:r>
+        <w:rPr/>
+        <w:t xml:space="preserve">Figure </w:t>
+      </w:r>
+      <w:r>
+        <w:rPr/>
+        <w:fldChar w:fldCharType="begin"/>
+      </w:r>
+      <w:r>
+        <w:rPr/>
+        <w:instrText xml:space="preserve"> SEQ Figure \* ARABIC </w:instrText>
+      </w:r>
+      <w:r>
+        <w:rPr/>
+        <w:fldChar w:fldCharType="separate"/>
+      </w:r>
+      <w:r>
+        <w:rPr/>
+        <w:t>2</w:t>
+      </w:r>
+      <w:r>
+        <w:rPr/>
+        <w:fldChar w:fldCharType="end"/>
+      </w:r>
+      <w:r>
+        <w:rPr/>
+        <w:t>: Performance Ratio Evolution with corridor</w:t>
+      </w:r>
+    </w:p>
+    <w:p>
+      <w:pPr>
+        <w:pStyle w:val="Normal"/>
+        <w:keepNext w:val="true"/>
+        <w:spacing w:lineRule="auto" w:line="240"/>
+        <w:jc w:val="center"/>
+        <w:rPr/>
+      </w:pPr>
+      <w:r>
+        <w:rPr/>
+        <w:drawing>
+          <wp:inline distT="0" distB="0" distL="0" distR="0">
+            <wp:extent cx="5579745" cy="2771775"/>
+            <wp:effectExtent l="0" t="0" r="0" b="0"/>
+            <wp:docPr id="14" name="Picture 14"/>
+            <wp:cNvGraphicFramePr>
+              <a:graphicFrameLocks xmlns:a="http://schemas.openxmlformats.org/drawingml/2006/main" noChangeAspect="1"/>
+            </wp:cNvGraphicFramePr>
+            <a:graphic xmlns:a="http://schemas.openxmlformats.org/drawingml/2006/main">
+              <a:graphicData uri="http://schemas.openxmlformats.org/drawingml/2006/picture">
+                <pic:pic xmlns:pic="http://schemas.openxmlformats.org/drawingml/2006/picture">
+                  <pic:nvPicPr>
+                    <pic:cNvPr id="14" name="Picture 14"/>
+                    <pic:cNvPicPr>
+                      <a:picLocks noChangeAspect="1" noChangeArrowheads="1"/>
+                    </pic:cNvPicPr>
+                  </pic:nvPicPr>
+                  <pic:blipFill>
+                    <a:blip r:embed="rId18"/>
+                    <a:stretch>
+                      <a:fillRect/>
+                    </a:stretch>
+                  </pic:blipFill>
+                  <pic:spPr bwMode="auto">
+                    <a:xfrm>
+                      <a:off x="0" y="0"/>
+                      <a:ext cx="5579745" cy="2771775"/>
+                    </a:xfrm>
+                    <a:prstGeom prst="rect">
+                      <a:avLst/>
+                    </a:prstGeom>
+                    <a:noFill/>
+                  </pic:spPr>
+                </pic:pic>
+              </a:graphicData>
+            </a:graphic>
+          </wp:inline>
+        </w:drawing>
+      </w:r>
+    </w:p>
+    <w:p>
+      <w:pPr>
+        <w:pStyle w:val="Caption"/>
+        <w:rPr/>
+      </w:pPr>
+      <w:r>
+        <w:rPr/>
+        <w:t xml:space="preserve">Figure </w:t>
+      </w:r>
+      <w:r>
+        <w:rPr/>
+        <w:fldChar w:fldCharType="begin"/>
+      </w:r>
+      <w:r>
+        <w:rPr/>
+        <w:instrText xml:space="preserve"> SEQ Figure \* ARABIC </w:instrText>
+      </w:r>
+      <w:r>
+        <w:rPr/>
+        <w:fldChar w:fldCharType="separate"/>
+      </w:r>
+      <w:r>
+        <w:rPr/>
+        <w:t>3</w:t>
+      </w:r>
+      <w:r>
+        <w:rPr/>
+        <w:fldChar w:fldCharType="end"/>
+      </w:r>
+      <w:r>
+        <w:rPr/>
+        <w:t>: Irradiation vs Yield</w:t>
+      </w:r>
+    </w:p>
+    <w:p>
+      <w:pPr>
+        <w:pStyle w:val="Normal"/>
+        <w:keepNext w:val="true"/>
+        <w:spacing w:lineRule="auto" w:line="240"/>
+        <w:jc w:val="center"/>
+        <w:rPr/>
+      </w:pPr>
+      <w:r>
+        <w:rPr/>
+        <w:drawing>
+          <wp:inline distT="0" distB="0" distL="0" distR="0">
+            <wp:extent cx="5579745" cy="2771775"/>
+            <wp:effectExtent l="0" t="0" r="0" b="0"/>
+            <wp:docPr id="15" name="Picture 15"/>
+            <wp:cNvGraphicFramePr>
+              <a:graphicFrameLocks xmlns:a="http://schemas.openxmlformats.org/drawingml/2006/main" noChangeAspect="1"/>
+            </wp:cNvGraphicFramePr>
+            <a:graphic xmlns:a="http://schemas.openxmlformats.org/drawingml/2006/main">
+              <a:graphicData uri="http://schemas.openxmlformats.org/drawingml/2006/picture">
+                <pic:pic xmlns:pic="http://schemas.openxmlformats.org/drawingml/2006/picture">
+                  <pic:nvPicPr>
+                    <pic:cNvPr id="15" name="Picture 15"/>
+                    <pic:cNvPicPr>
+                      <a:picLocks noChangeAspect="1" noChangeArrowheads="1"/>
+                    </pic:cNvPicPr>
+                  </pic:nvPicPr>
+                  <pic:blipFill>
+                    <a:blip r:embed="rId19"/>
+                    <a:stretch>
+                      <a:fillRect/>
+                    </a:stretch>
+                  </pic:blipFill>
+                  <pic:spPr bwMode="auto">
+                    <a:xfrm>
+                      <a:off x="0" y="0"/>
+                      <a:ext cx="5579745" cy="2771775"/>
+                    </a:xfrm>
+                    <a:prstGeom prst="rect">
+                      <a:avLst/>
+                    </a:prstGeom>
+                    <a:noFill/>
+                  </pic:spPr>
+                </pic:pic>
+              </a:graphicData>
+            </a:graphic>
+          </wp:inline>
+        </w:drawing>
+      </w:r>
+    </w:p>
+    <w:p>
+      <w:pPr>
+        <w:pStyle w:val="Caption"/>
+        <w:rPr/>
+      </w:pPr>
+      <w:r>
+        <w:rPr/>
+        <w:t xml:space="preserve">Figure </w:t>
+      </w:r>
+      <w:r>
+        <w:rPr/>
+        <w:fldChar w:fldCharType="begin"/>
+      </w:r>
+      <w:r>
+        <w:rPr/>
+        <w:instrText xml:space="preserve"> SEQ Figure \* ARABIC </w:instrText>
+      </w:r>
+      <w:r>
+        <w:rPr/>
+        <w:fldChar w:fldCharType="separate"/>
+      </w:r>
+      <w:r>
+        <w:rPr/>
+        <w:t>4</w:t>
+      </w:r>
+      <w:r>
+        <w:rPr/>
+        <w:fldChar w:fldCharType="end"/>
+      </w:r>
+      <w:r>
+        <w:rPr/>
+        <w:t>: Inverter Performance Heatmap</w:t>
+      </w:r>
+    </w:p>
+    <w:p>
+      <w:pPr>
+        <w:pStyle w:val="Normal"/>
+        <w:keepNext w:val="true"/>
+        <w:spacing w:lineRule="auto" w:line="240"/>
+        <w:jc w:val="center"/>
+        <w:rPr/>
+      </w:pPr>
+      <w:r>
+        <w:rPr/>
+        <w:drawing>
+          <wp:inline distT="0" distB="0" distL="0" distR="0">
+            <wp:extent cx="5579745" cy="2665095"/>
+            <wp:effectExtent l="0" t="0" r="0" b="0"/>
+            <wp:docPr id="16" name="Picture 16"/>
+            <wp:cNvGraphicFramePr>
+              <a:graphicFrameLocks xmlns:a="http://schemas.openxmlformats.org/drawingml/2006/main" noChangeAspect="1"/>
+            </wp:cNvGraphicFramePr>
+            <a:graphic xmlns:a="http://schemas.openxmlformats.org/drawingml/2006/main">
+              <a:graphicData uri="http://schemas.openxmlformats.org/drawingml/2006/picture">
+                <pic:pic xmlns:pic="http://schemas.openxmlformats.org/drawingml/2006/picture">
+                  <pic:nvPicPr>
+                    <pic:cNvPr id="16" name="Picture 16"/>
+                    <pic:cNvPicPr>
+                      <a:picLocks noChangeAspect="1" noChangeArrowheads="1"/>
+                    </pic:cNvPicPr>
+                  </pic:nvPicPr>
+                  <pic:blipFill>
+                    <a:blip r:embed="rId20"/>
+                    <a:stretch>
+                      <a:fillRect/>
+                    </a:stretch>
+                  </pic:blipFill>
+                  <pic:spPr bwMode="auto">
+                    <a:xfrm>
+                      <a:off x="0" y="0"/>
                       <a:ext cx="5579745" cy="2665095"/>
                     </a:xfrm>
                     <a:prstGeom prst="rect">
@@ -10837,10 +10948,14 @@
             </w:pPr>
             <w:r>
               <w:rPr>
-                <w:kern w:val="0"/>
-                <w:szCs w:val="22"/>
-                <w:lang w:val="en-US" w:eastAsia="en-US" w:bidi="ar-SA"/>
-              </w:rPr>
+                <w:rFonts w:eastAsia="Times New Roman"/>
+                <w:b w:val="false"/>
+                <w:kern w:val="0"/>
+                <w:sz w:val="17"/>
+                <w:szCs w:val="22"/>
+                <w:lang w:val="en-US" w:eastAsia="en-US" w:bidi="ar-SA"/>
+              </w:rPr>
+              <w:t>Sunil Maggu</w:t>
             </w:r>
           </w:p>
         </w:tc>
@@ -11405,11 +11520,58 @@
       </w:pPr>
       <w:r>
         <w:rPr>
-          <w:rFonts w:eastAsia="Times New Roman"/>
-          <w:b w:val="false"/>
-          <w:sz w:val="18"/>
-        </w:rPr>
-        <w:t>Student Signature: __________________________   Date: 08 May 2026</w:t>
+          <w:b w:val="false"/>
+          <w:sz w:val="18"/>
+        </w:rPr>
+        <w:t xml:space="preserve">Student Signature: </w:t>
+      </w:r>
+      <w:r>
+        <w:rPr/>
+        <w:drawing>
+          <wp:inline distT="0" distB="0" distL="0" distR="0">
+            <wp:extent cx="2192655" cy="269875"/>
+            <wp:effectExtent l="0" t="0" r="0" b="0"/>
+            <wp:docPr id="17" name="Image3"/>
+            <wp:cNvGraphicFramePr>
+              <a:graphicFrameLocks xmlns:a="http://schemas.openxmlformats.org/drawingml/2006/main" noChangeAspect="1"/>
+            </wp:cNvGraphicFramePr>
+            <a:graphic xmlns:a="http://schemas.openxmlformats.org/drawingml/2006/main">
+              <a:graphicData uri="http://schemas.openxmlformats.org/drawingml/2006/picture">
+                <pic:pic xmlns:pic="http://schemas.openxmlformats.org/drawingml/2006/picture">
+                  <pic:nvPicPr>
+                    <pic:cNvPr id="17" name="Image3"/>
+                    <pic:cNvPicPr>
+                      <a:picLocks noChangeAspect="1" noChangeArrowheads="1"/>
+                    </pic:cNvPicPr>
+                  </pic:nvPicPr>
+                  <pic:blipFill>
+                    <a:blip r:embed="rId21"/>
+                    <a:stretch>
+                      <a:fillRect/>
+                    </a:stretch>
+                  </pic:blipFill>
+                  <pic:spPr bwMode="auto">
+                    <a:xfrm>
+                      <a:off x="0" y="0"/>
+                      <a:ext cx="2192655" cy="269875"/>
+                    </a:xfrm>
+                    <a:prstGeom prst="rect">
+                      <a:avLst/>
+                    </a:prstGeom>
+                    <a:noFill/>
+                  </pic:spPr>
+                </pic:pic>
+              </a:graphicData>
+            </a:graphic>
+          </wp:inline>
+        </w:drawing>
+      </w:r>
+      <w:r>
+        <w:rPr>
+          <w:b w:val="false"/>
+          <w:sz w:val="18"/>
+        </w:rPr>
+        <w:t xml:space="preserve">   Date: 08 May 2026</w:t>
       </w:r>
     </w:p>
     <w:p>
@@ -11425,7 +11587,7 @@
           <w:b w:val="false"/>
           <w:sz w:val="18"/>
         </w:rPr>
-        <w:t>Industry Mentor / Research Supervisor Remarks: ______________________________________________________</w:t>
+        <w:t>Industry Mentor / Research Supervisor Remarks: Good start; onboarded quickly and picked up the codebase.</w:t>
       </w:r>
     </w:p>
     <w:p>
@@ -11441,7 +11603,7 @@
           <w:b w:val="false"/>
           <w:sz w:val="18"/>
         </w:rPr>
-        <w:t>Signature: _________________________________   Date: __________________</w:t>
+        <w:t>Signature: ______________________   Name: Mr. Manav Gupta   Date: 08 May 2026</w:t>
       </w:r>
       <w:r>
         <w:br w:type="page"/>
@@ -12290,10 +12452,14 @@
             </w:pPr>
             <w:r>
               <w:rPr>
-                <w:kern w:val="0"/>
-                <w:szCs w:val="22"/>
-                <w:lang w:val="en-US" w:eastAsia="en-US" w:bidi="ar-SA"/>
-              </w:rPr>
+                <w:rFonts w:eastAsia="Times New Roman"/>
+                <w:b w:val="false"/>
+                <w:kern w:val="0"/>
+                <w:sz w:val="17"/>
+                <w:szCs w:val="22"/>
+                <w:lang w:val="en-US" w:eastAsia="en-US" w:bidi="ar-SA"/>
+              </w:rPr>
+              <w:t>Sunil Maggu</w:t>
             </w:r>
           </w:p>
         </w:tc>
@@ -12858,11 +13024,58 @@
       </w:pPr>
       <w:r>
         <w:rPr>
-          <w:rFonts w:eastAsia="Times New Roman"/>
-          <w:b w:val="false"/>
-          <w:sz w:val="18"/>
-        </w:rPr>
-        <w:t>Student Signature: __________________________   Date: 15 May 2026</w:t>
+          <w:b w:val="false"/>
+          <w:sz w:val="18"/>
+        </w:rPr>
+        <w:t xml:space="preserve">Student Signature: </w:t>
+      </w:r>
+      <w:r>
+        <w:rPr/>
+        <w:drawing>
+          <wp:inline distT="0" distB="0" distL="0" distR="0">
+            <wp:extent cx="2192655" cy="269875"/>
+            <wp:effectExtent l="0" t="0" r="0" b="0"/>
+            <wp:docPr id="18" name="Image4"/>
+            <wp:cNvGraphicFramePr>
+              <a:graphicFrameLocks xmlns:a="http://schemas.openxmlformats.org/drawingml/2006/main" noChangeAspect="1"/>
+            </wp:cNvGraphicFramePr>
+            <a:graphic xmlns:a="http://schemas.openxmlformats.org/drawingml/2006/main">
+              <a:graphicData uri="http://schemas.openxmlformats.org/drawingml/2006/picture">
+                <pic:pic xmlns:pic="http://schemas.openxmlformats.org/drawingml/2006/picture">
+                  <pic:nvPicPr>
+                    <pic:cNvPr id="18" name="Image4"/>
+                    <pic:cNvPicPr>
+                      <a:picLocks noChangeAspect="1" noChangeArrowheads="1"/>
+                    </pic:cNvPicPr>
+                  </pic:nvPicPr>
+                  <pic:blipFill>
+                    <a:blip r:embed="rId22"/>
+                    <a:stretch>
+                      <a:fillRect/>
+                    </a:stretch>
+                  </pic:blipFill>
+                  <pic:spPr bwMode="auto">
+                    <a:xfrm>
+                      <a:off x="0" y="0"/>
+                      <a:ext cx="2192655" cy="269875"/>
+                    </a:xfrm>
+                    <a:prstGeom prst="rect">
+                      <a:avLst/>
+                    </a:prstGeom>
+                    <a:noFill/>
+                  </pic:spPr>
+                </pic:pic>
+              </a:graphicData>
+            </a:graphic>
+          </wp:inline>
+        </w:drawing>
+      </w:r>
+      <w:r>
+        <w:rPr>
+          <w:b w:val="false"/>
+          <w:sz w:val="18"/>
+        </w:rPr>
+        <w:t xml:space="preserve">   Date: 15 May 2026</w:t>
       </w:r>
     </w:p>
     <w:p>
@@ -12878,7 +13091,7 @@
           <w:b w:val="false"/>
           <w:sz w:val="18"/>
         </w:rPr>
-        <w:t>Industry Mentor / Research Supervisor Remarks: ______________________________________________________</w:t>
+        <w:t>Industry Mentor / Research Supervisor Remarks: Chart revisions done well; responsive to review comments.</w:t>
       </w:r>
     </w:p>
     <w:p>
@@ -12894,7 +13107,7 @@
           <w:b w:val="false"/>
           <w:sz w:val="18"/>
         </w:rPr>
-        <w:t>Signature: _________________________________   Date: __________________</w:t>
+        <w:t>Signature: ______________________   Name: Mr. Manav Gupta   Date: 15 May 2026</w:t>
       </w:r>
       <w:r>
         <w:br w:type="page"/>
@@ -13743,10 +13956,14 @@
             </w:pPr>
             <w:r>
               <w:rPr>
-                <w:kern w:val="0"/>
-                <w:szCs w:val="22"/>
-                <w:lang w:val="en-US" w:eastAsia="en-US" w:bidi="ar-SA"/>
-              </w:rPr>
+                <w:rFonts w:eastAsia="Times New Roman"/>
+                <w:b w:val="false"/>
+                <w:kern w:val="0"/>
+                <w:sz w:val="17"/>
+                <w:szCs w:val="22"/>
+                <w:lang w:val="en-US" w:eastAsia="en-US" w:bidi="ar-SA"/>
+              </w:rPr>
+              <w:t>Sunil Maggu</w:t>
             </w:r>
           </w:p>
         </w:tc>
@@ -14311,11 +14528,58 @@
       </w:pPr>
       <w:r>
         <w:rPr>
-          <w:rFonts w:eastAsia="Times New Roman"/>
-          <w:b w:val="false"/>
-          <w:sz w:val="18"/>
-        </w:rPr>
-        <w:t>Student Signature: __________________________   Date: 22 May 2026</w:t>
+          <w:b w:val="false"/>
+          <w:sz w:val="18"/>
+        </w:rPr>
+        <w:t xml:space="preserve">Student Signature: </w:t>
+      </w:r>
+      <w:r>
+        <w:rPr/>
+        <w:drawing>
+          <wp:inline distT="0" distB="0" distL="0" distR="0">
+            <wp:extent cx="2192655" cy="269875"/>
+            <wp:effectExtent l="0" t="0" r="0" b="0"/>
+            <wp:docPr id="19" name="Image5"/>
+            <wp:cNvGraphicFramePr>
+              <a:graphicFrameLocks xmlns:a="http://schemas.openxmlformats.org/drawingml/2006/main" noChangeAspect="1"/>
+            </wp:cNvGraphicFramePr>
+            <a:graphic xmlns:a="http://schemas.openxmlformats.org/drawingml/2006/main">
+              <a:graphicData uri="http://schemas.openxmlformats.org/drawingml/2006/picture">
+                <pic:pic xmlns:pic="http://schemas.openxmlformats.org/drawingml/2006/picture">
+                  <pic:nvPicPr>
+                    <pic:cNvPr id="19" name="Image5"/>
+                    <pic:cNvPicPr>
+                      <a:picLocks noChangeAspect="1" noChangeArrowheads="1"/>
+                    </pic:cNvPicPr>
+                  </pic:nvPicPr>
+                  <pic:blipFill>
+                    <a:blip r:embed="rId23"/>
+                    <a:stretch>
+                      <a:fillRect/>
+                    </a:stretch>
+                  </pic:blipFill>
+                  <pic:spPr bwMode="auto">
+                    <a:xfrm>
+                      <a:off x="0" y="0"/>
+                      <a:ext cx="2192655" cy="269875"/>
+                    </a:xfrm>
+                    <a:prstGeom prst="rect">
+                      <a:avLst/>
+                    </a:prstGeom>
+                    <a:noFill/>
+                  </pic:spPr>
+                </pic:pic>
+              </a:graphicData>
+            </a:graphic>
+          </wp:inline>
+        </w:drawing>
+      </w:r>
+      <w:r>
+        <w:rPr>
+          <w:b w:val="false"/>
+          <w:sz w:val="18"/>
+        </w:rPr>
+        <w:t xml:space="preserve">   Date: 22 May 2026</w:t>
       </w:r>
     </w:p>
     <w:p>
@@ -14331,7 +14595,7 @@
           <w:b w:val="false"/>
           <w:sz w:val="18"/>
         </w:rPr>
-        <w:t>Industry Mentor / Research Supervisor Remarks: ______________________________________________________</w:t>
+        <w:t>Industry Mentor / Research Supervisor Remarks: Consistent UI across monitoring pages; good attention to detail.</w:t>
       </w:r>
     </w:p>
     <w:p>
@@ -14347,7 +14611,7 @@
           <w:b w:val="false"/>
           <w:sz w:val="18"/>
         </w:rPr>
-        <w:t>Signature: _________________________________   Date: __________________</w:t>
+        <w:t>Signature: ______________________   Name: Mr. Manav Gupta   Date: 22 May 2026</w:t>
       </w:r>
       <w:r>
         <w:br w:type="page"/>
@@ -15196,10 +15460,14 @@
             </w:pPr>
             <w:r>
               <w:rPr>
-                <w:kern w:val="0"/>
-                <w:szCs w:val="22"/>
-                <w:lang w:val="en-US" w:eastAsia="en-US" w:bidi="ar-SA"/>
-              </w:rPr>
+                <w:rFonts w:eastAsia="Times New Roman"/>
+                <w:b w:val="false"/>
+                <w:kern w:val="0"/>
+                <w:sz w:val="17"/>
+                <w:szCs w:val="22"/>
+                <w:lang w:val="en-US" w:eastAsia="en-US" w:bidi="ar-SA"/>
+              </w:rPr>
+              <w:t>Sunil Maggu</w:t>
             </w:r>
           </w:p>
         </w:tc>
@@ -15764,11 +16032,58 @@
       </w:pPr>
       <w:r>
         <w:rPr>
-          <w:rFonts w:eastAsia="Times New Roman"/>
-          <w:b w:val="false"/>
-          <w:sz w:val="18"/>
-        </w:rPr>
-        <w:t>Student Signature: __________________________   Date: 29 May 2026</w:t>
+          <w:b w:val="false"/>
+          <w:sz w:val="18"/>
+        </w:rPr>
+        <w:t xml:space="preserve">Student Signature: </w:t>
+      </w:r>
+      <w:r>
+        <w:rPr/>
+        <w:drawing>
+          <wp:inline distT="0" distB="0" distL="0" distR="0">
+            <wp:extent cx="2192655" cy="269875"/>
+            <wp:effectExtent l="0" t="0" r="0" b="0"/>
+            <wp:docPr id="20" name="Image6"/>
+            <wp:cNvGraphicFramePr>
+              <a:graphicFrameLocks xmlns:a="http://schemas.openxmlformats.org/drawingml/2006/main" noChangeAspect="1"/>
+            </wp:cNvGraphicFramePr>
+            <a:graphic xmlns:a="http://schemas.openxmlformats.org/drawingml/2006/main">
+              <a:graphicData uri="http://schemas.openxmlformats.org/drawingml/2006/picture">
+                <pic:pic xmlns:pic="http://schemas.openxmlformats.org/drawingml/2006/picture">
+                  <pic:nvPicPr>
+                    <pic:cNvPr id="20" name="Image6"/>
+                    <pic:cNvPicPr>
+                      <a:picLocks noChangeAspect="1" noChangeArrowheads="1"/>
+                    </pic:cNvPicPr>
+                  </pic:nvPicPr>
+                  <pic:blipFill>
+                    <a:blip r:embed="rId24"/>
+                    <a:stretch>
+                      <a:fillRect/>
+                    </a:stretch>
+                  </pic:blipFill>
+                  <pic:spPr bwMode="auto">
+                    <a:xfrm>
+                      <a:off x="0" y="0"/>
+                      <a:ext cx="2192655" cy="269875"/>
+                    </a:xfrm>
+                    <a:prstGeom prst="rect">
+                      <a:avLst/>
+                    </a:prstGeom>
+                    <a:noFill/>
+                  </pic:spPr>
+                </pic:pic>
+              </a:graphicData>
+            </a:graphic>
+          </wp:inline>
+        </w:drawing>
+      </w:r>
+      <w:r>
+        <w:rPr>
+          <w:b w:val="false"/>
+          <w:sz w:val="18"/>
+        </w:rPr>
+        <w:t xml:space="preserve">   Date: 29 May 2026</w:t>
       </w:r>
     </w:p>
     <w:p>
@@ -15784,7 +16099,7 @@
           <w:b w:val="false"/>
           <w:sz w:val="18"/>
         </w:rPr>
-        <w:t>Industry Mentor / Research Supervisor Remarks: ______________________________________________________</w:t>
+        <w:t>Industry Mentor / Research Supervisor Remarks: Map and export fixes delivered on time.</w:t>
       </w:r>
     </w:p>
     <w:p>
@@ -15800,7 +16115,7 @@
           <w:b w:val="false"/>
           <w:sz w:val="18"/>
         </w:rPr>
-        <w:t>Signature: _________________________________   Date: __________________</w:t>
+        <w:t>Signature: ______________________   Name: Mr. Manav Gupta   Date: 29 May 2026</w:t>
       </w:r>
       <w:r>
         <w:br w:type="page"/>
@@ -16649,10 +16964,14 @@
             </w:pPr>
             <w:r>
               <w:rPr>
-                <w:kern w:val="0"/>
-                <w:szCs w:val="22"/>
-                <w:lang w:val="en-US" w:eastAsia="en-US" w:bidi="ar-SA"/>
-              </w:rPr>
+                <w:rFonts w:eastAsia="Times New Roman"/>
+                <w:b w:val="false"/>
+                <w:kern w:val="0"/>
+                <w:sz w:val="17"/>
+                <w:szCs w:val="22"/>
+                <w:lang w:val="en-US" w:eastAsia="en-US" w:bidi="ar-SA"/>
+              </w:rPr>
+              <w:t>Sunil Maggu</w:t>
             </w:r>
           </w:p>
         </w:tc>
@@ -17217,11 +17536,58 @@
       </w:pPr>
       <w:r>
         <w:rPr>
-          <w:rFonts w:eastAsia="Times New Roman"/>
-          <w:b w:val="false"/>
-          <w:sz w:val="18"/>
-        </w:rPr>
-        <w:t>Student Signature: __________________________   Date: 05 June 2026</w:t>
+          <w:b w:val="false"/>
+          <w:sz w:val="18"/>
+        </w:rPr>
+        <w:t xml:space="preserve">Student Signature: </w:t>
+      </w:r>
+      <w:r>
+        <w:rPr/>
+        <w:drawing>
+          <wp:inline distT="0" distB="0" distL="0" distR="0">
+            <wp:extent cx="2192655" cy="269875"/>
+            <wp:effectExtent l="0" t="0" r="0" b="0"/>
+            <wp:docPr id="21" name="Image7"/>
+            <wp:cNvGraphicFramePr>
+              <a:graphicFrameLocks xmlns:a="http://schemas.openxmlformats.org/drawingml/2006/main" noChangeAspect="1"/>
+            </wp:cNvGraphicFramePr>
+            <a:graphic xmlns:a="http://schemas.openxmlformats.org/drawingml/2006/main">
+              <a:graphicData uri="http://schemas.openxmlformats.org/drawingml/2006/picture">
+                <pic:pic xmlns:pic="http://schemas.openxmlformats.org/drawingml/2006/picture">
+                  <pic:nvPicPr>
+                    <pic:cNvPr id="21" name="Image7"/>
+                    <pic:cNvPicPr>
+                      <a:picLocks noChangeAspect="1" noChangeArrowheads="1"/>
+                    </pic:cNvPicPr>
+                  </pic:nvPicPr>
+                  <pic:blipFill>
+                    <a:blip r:embed="rId25"/>
+                    <a:stretch>
+                      <a:fillRect/>
+                    </a:stretch>
+                  </pic:blipFill>
+                  <pic:spPr bwMode="auto">
+                    <a:xfrm>
+                      <a:off x="0" y="0"/>
+                      <a:ext cx="2192655" cy="269875"/>
+                    </a:xfrm>
+                    <a:prstGeom prst="rect">
+                      <a:avLst/>
+                    </a:prstGeom>
+                    <a:noFill/>
+                  </pic:spPr>
+                </pic:pic>
+              </a:graphicData>
+            </a:graphic>
+          </wp:inline>
+        </w:drawing>
+      </w:r>
+      <w:r>
+        <w:rPr>
+          <w:b w:val="false"/>
+          <w:sz w:val="18"/>
+        </w:rPr>
+        <w:t xml:space="preserve">   Date: 05 June 2026</w:t>
       </w:r>
     </w:p>
     <w:p>
@@ -17237,7 +17603,7 @@
           <w:b w:val="false"/>
           <w:sz w:val="18"/>
         </w:rPr>
-        <w:t>Industry Mentor / Research Supervisor Remarks: ______________________________________________________</w:t>
+        <w:t>Industry Mentor / Research Supervisor Remarks: Period-filter bugs fixed correctly despite leave.</w:t>
       </w:r>
     </w:p>
     <w:p>
@@ -17253,7 +17619,7 @@
           <w:b w:val="false"/>
           <w:sz w:val="18"/>
         </w:rPr>
-        <w:t>Signature: _________________________________   Date: __________________</w:t>
+        <w:t>Signature: ______________________   Name: Mr. Manav Gupta   Date: 05 June 2026</w:t>
       </w:r>
       <w:r>
         <w:br w:type="page"/>
@@ -18102,10 +18468,14 @@
             </w:pPr>
             <w:r>
               <w:rPr>
-                <w:kern w:val="0"/>
-                <w:szCs w:val="22"/>
-                <w:lang w:val="en-US" w:eastAsia="en-US" w:bidi="ar-SA"/>
-              </w:rPr>
+                <w:rFonts w:eastAsia="Times New Roman"/>
+                <w:b w:val="false"/>
+                <w:kern w:val="0"/>
+                <w:sz w:val="17"/>
+                <w:szCs w:val="22"/>
+                <w:lang w:val="en-US" w:eastAsia="en-US" w:bidi="ar-SA"/>
+              </w:rPr>
+              <w:t>Sunil Maggu</w:t>
             </w:r>
           </w:p>
         </w:tc>
@@ -18670,11 +19040,58 @@
       </w:pPr>
       <w:r>
         <w:rPr>
-          <w:rFonts w:eastAsia="Times New Roman"/>
-          <w:b w:val="false"/>
-          <w:sz w:val="18"/>
-        </w:rPr>
-        <w:t>Student Signature: __________________________   Date: 12 June 2026</w:t>
+          <w:b w:val="false"/>
+          <w:sz w:val="18"/>
+        </w:rPr>
+        <w:t xml:space="preserve">Student Signature: </w:t>
+      </w:r>
+      <w:r>
+        <w:rPr/>
+        <w:drawing>
+          <wp:inline distT="0" distB="0" distL="0" distR="0">
+            <wp:extent cx="2192655" cy="269875"/>
+            <wp:effectExtent l="0" t="0" r="0" b="0"/>
+            <wp:docPr id="22" name="Image8"/>
+            <wp:cNvGraphicFramePr>
+              <a:graphicFrameLocks xmlns:a="http://schemas.openxmlformats.org/drawingml/2006/main" noChangeAspect="1"/>
+            </wp:cNvGraphicFramePr>
+            <a:graphic xmlns:a="http://schemas.openxmlformats.org/drawingml/2006/main">
+              <a:graphicData uri="http://schemas.openxmlformats.org/drawingml/2006/picture">
+                <pic:pic xmlns:pic="http://schemas.openxmlformats.org/drawingml/2006/picture">
+                  <pic:nvPicPr>
+                    <pic:cNvPr id="22" name="Image8"/>
+                    <pic:cNvPicPr>
+                      <a:picLocks noChangeAspect="1" noChangeArrowheads="1"/>
+                    </pic:cNvPicPr>
+                  </pic:nvPicPr>
+                  <pic:blipFill>
+                    <a:blip r:embed="rId26"/>
+                    <a:stretch>
+                      <a:fillRect/>
+                    </a:stretch>
+                  </pic:blipFill>
+                  <pic:spPr bwMode="auto">
+                    <a:xfrm>
+                      <a:off x="0" y="0"/>
+                      <a:ext cx="2192655" cy="269875"/>
+                    </a:xfrm>
+                    <a:prstGeom prst="rect">
+                      <a:avLst/>
+                    </a:prstGeom>
+                    <a:noFill/>
+                  </pic:spPr>
+                </pic:pic>
+              </a:graphicData>
+            </a:graphic>
+          </wp:inline>
+        </w:drawing>
+      </w:r>
+      <w:r>
+        <w:rPr>
+          <w:b w:val="false"/>
+          <w:sz w:val="18"/>
+        </w:rPr>
+        <w:t xml:space="preserve">   Date: 12 June 2026</w:t>
       </w:r>
     </w:p>
     <w:p>
@@ -18690,7 +19107,7 @@
           <w:b w:val="false"/>
           <w:sz w:val="18"/>
         </w:rPr>
-        <w:t>Industry Mentor / Research Supervisor Remarks: ______________________________________________________</w:t>
+        <w:t>Industry Mentor / Research Supervisor Remarks: Filter components well built.</w:t>
       </w:r>
     </w:p>
     <w:p>
@@ -18706,7 +19123,7 @@
           <w:b w:val="false"/>
           <w:sz w:val="18"/>
         </w:rPr>
-        <w:t>Signature: _________________________________   Date: __________________</w:t>
+        <w:t>Signature: ______________________   Name: Mr. Manav Gupta   Date: 12 June 2026</w:t>
       </w:r>
       <w:r>
         <w:br w:type="page"/>
@@ -19555,10 +19972,14 @@
             </w:pPr>
             <w:r>
               <w:rPr>
-                <w:kern w:val="0"/>
-                <w:szCs w:val="22"/>
-                <w:lang w:val="en-US" w:eastAsia="en-US" w:bidi="ar-SA"/>
-              </w:rPr>
+                <w:rFonts w:eastAsia="Times New Roman"/>
+                <w:b w:val="false"/>
+                <w:kern w:val="0"/>
+                <w:sz w:val="17"/>
+                <w:szCs w:val="22"/>
+                <w:lang w:val="en-US" w:eastAsia="en-US" w:bidi="ar-SA"/>
+              </w:rPr>
+              <w:t>Sunil Maggu</w:t>
             </w:r>
           </w:p>
         </w:tc>
@@ -20123,11 +20544,58 @@
       </w:pPr>
       <w:r>
         <w:rPr>
-          <w:rFonts w:eastAsia="Times New Roman"/>
-          <w:b w:val="false"/>
-          <w:sz w:val="18"/>
-        </w:rPr>
-        <w:t>Student Signature: __________________________   Date: 19 June 2026</w:t>
+          <w:b w:val="false"/>
+          <w:sz w:val="18"/>
+        </w:rPr>
+        <w:t xml:space="preserve">Student Signature: </w:t>
+      </w:r>
+      <w:r>
+        <w:rPr/>
+        <w:drawing>
+          <wp:inline distT="0" distB="0" distL="0" distR="0">
+            <wp:extent cx="2192655" cy="269875"/>
+            <wp:effectExtent l="0" t="0" r="0" b="0"/>
+            <wp:docPr id="23" name="Image9"/>
+            <wp:cNvGraphicFramePr>
+              <a:graphicFrameLocks xmlns:a="http://schemas.openxmlformats.org/drawingml/2006/main" noChangeAspect="1"/>
+            </wp:cNvGraphicFramePr>
+            <a:graphic xmlns:a="http://schemas.openxmlformats.org/drawingml/2006/main">
+              <a:graphicData uri="http://schemas.openxmlformats.org/drawingml/2006/picture">
+                <pic:pic xmlns:pic="http://schemas.openxmlformats.org/drawingml/2006/picture">
+                  <pic:nvPicPr>
+                    <pic:cNvPr id="23" name="Image9"/>
+                    <pic:cNvPicPr>
+                      <a:picLocks noChangeAspect="1" noChangeArrowheads="1"/>
+                    </pic:cNvPicPr>
+                  </pic:nvPicPr>
+                  <pic:blipFill>
+                    <a:blip r:embed="rId27"/>
+                    <a:stretch>
+                      <a:fillRect/>
+                    </a:stretch>
+                  </pic:blipFill>
+                  <pic:spPr bwMode="auto">
+                    <a:xfrm>
+                      <a:off x="0" y="0"/>
+                      <a:ext cx="2192655" cy="269875"/>
+                    </a:xfrm>
+                    <a:prstGeom prst="rect">
+                      <a:avLst/>
+                    </a:prstGeom>
+                    <a:noFill/>
+                  </pic:spPr>
+                </pic:pic>
+              </a:graphicData>
+            </a:graphic>
+          </wp:inline>
+        </w:drawing>
+      </w:r>
+      <w:r>
+        <w:rPr>
+          <w:b w:val="false"/>
+          <w:sz w:val="18"/>
+        </w:rPr>
+        <w:t xml:space="preserve">   Date: 19 June 2026</w:t>
       </w:r>
     </w:p>
     <w:p>
@@ -20143,7 +20611,7 @@
           <w:b w:val="false"/>
           <w:sz w:val="18"/>
         </w:rPr>
-        <w:t>Industry Mentor / Research Supervisor Remarks: ______________________________________________________</w:t>
+        <w:t>Industry Mentor / Research Supervisor Remarks: Clear date/filter rules defined; good work.</w:t>
       </w:r>
     </w:p>
     <w:p>
@@ -20159,7 +20627,7 @@
           <w:b w:val="false"/>
           <w:sz w:val="18"/>
         </w:rPr>
-        <w:t>Signature: _________________________________   Date: __________________</w:t>
+        <w:t>Signature: ______________________   Name: Mr. Manav Gupta   Date: 19 June 2026</w:t>
       </w:r>
       <w:r>
         <w:br w:type="page"/>
@@ -21008,10 +21476,14 @@
             </w:pPr>
             <w:r>
               <w:rPr>
-                <w:kern w:val="0"/>
-                <w:szCs w:val="22"/>
-                <w:lang w:val="en-US" w:eastAsia="en-US" w:bidi="ar-SA"/>
-              </w:rPr>
+                <w:rFonts w:eastAsia="Times New Roman"/>
+                <w:b w:val="false"/>
+                <w:kern w:val="0"/>
+                <w:sz w:val="17"/>
+                <w:szCs w:val="22"/>
+                <w:lang w:val="en-US" w:eastAsia="en-US" w:bidi="ar-SA"/>
+              </w:rPr>
+              <w:t>Sunil Maggu</w:t>
             </w:r>
           </w:p>
         </w:tc>
@@ -21576,11 +22048,58 @@
       </w:pPr>
       <w:r>
         <w:rPr>
-          <w:rFonts w:eastAsia="Times New Roman"/>
-          <w:b w:val="false"/>
-          <w:sz w:val="18"/>
-        </w:rPr>
-        <w:t>Student Signature: __________________________   Date: 26 June 2026</w:t>
+          <w:b w:val="false"/>
+          <w:sz w:val="18"/>
+        </w:rPr>
+        <w:t xml:space="preserve">Student Signature: </w:t>
+      </w:r>
+      <w:r>
+        <w:rPr/>
+        <w:drawing>
+          <wp:inline distT="0" distB="0" distL="0" distR="0">
+            <wp:extent cx="2192655" cy="269875"/>
+            <wp:effectExtent l="0" t="0" r="0" b="0"/>
+            <wp:docPr id="24" name="Image10"/>
+            <wp:cNvGraphicFramePr>
+              <a:graphicFrameLocks xmlns:a="http://schemas.openxmlformats.org/drawingml/2006/main" noChangeAspect="1"/>
+            </wp:cNvGraphicFramePr>
+            <a:graphic xmlns:a="http://schemas.openxmlformats.org/drawingml/2006/main">
+              <a:graphicData uri="http://schemas.openxmlformats.org/drawingml/2006/picture">
+                <pic:pic xmlns:pic="http://schemas.openxmlformats.org/drawingml/2006/picture">
+                  <pic:nvPicPr>
+                    <pic:cNvPr id="24" name="Image10"/>
+                    <pic:cNvPicPr>
+                      <a:picLocks noChangeAspect="1" noChangeArrowheads="1"/>
+                    </pic:cNvPicPr>
+                  </pic:nvPicPr>
+                  <pic:blipFill>
+                    <a:blip r:embed="rId28"/>
+                    <a:stretch>
+                      <a:fillRect/>
+                    </a:stretch>
+                  </pic:blipFill>
+                  <pic:spPr bwMode="auto">
+                    <a:xfrm>
+                      <a:off x="0" y="0"/>
+                      <a:ext cx="2192655" cy="269875"/>
+                    </a:xfrm>
+                    <a:prstGeom prst="rect">
+                      <a:avLst/>
+                    </a:prstGeom>
+                    <a:noFill/>
+                  </pic:spPr>
+                </pic:pic>
+              </a:graphicData>
+            </a:graphic>
+          </wp:inline>
+        </w:drawing>
+      </w:r>
+      <w:r>
+        <w:rPr>
+          <w:b w:val="false"/>
+          <w:sz w:val="18"/>
+        </w:rPr>
+        <w:t xml:space="preserve">   Date: 26 June 2026</w:t>
       </w:r>
     </w:p>
     <w:p>
@@ -21596,7 +22115,7 @@
           <w:b w:val="false"/>
           <w:sz w:val="18"/>
         </w:rPr>
-        <w:t>Industry Mentor / Research Supervisor Remarks: ______________________________________________________</w:t>
+        <w:t>Industry Mentor / Research Supervisor Remarks: Refactoring reduced duplicate code; well tested.</w:t>
       </w:r>
     </w:p>
     <w:p>
@@ -21612,7 +22131,7 @@
           <w:b w:val="false"/>
           <w:sz w:val="18"/>
         </w:rPr>
-        <w:t>Signature: _________________________________   Date: __________________</w:t>
+        <w:t>Signature: ______________________   Name: Mr. Manav Gupta   Date: 26 June 2026</w:t>
       </w:r>
       <w:r>
         <w:br w:type="page"/>
@@ -22461,10 +22980,14 @@
             </w:pPr>
             <w:r>
               <w:rPr>
-                <w:kern w:val="0"/>
-                <w:szCs w:val="22"/>
-                <w:lang w:val="en-US" w:eastAsia="en-US" w:bidi="ar-SA"/>
-              </w:rPr>
+                <w:rFonts w:eastAsia="Times New Roman"/>
+                <w:b w:val="false"/>
+                <w:kern w:val="0"/>
+                <w:sz w:val="17"/>
+                <w:szCs w:val="22"/>
+                <w:lang w:val="en-US" w:eastAsia="en-US" w:bidi="ar-SA"/>
+              </w:rPr>
+              <w:t>Sunil Maggu</w:t>
             </w:r>
           </w:p>
         </w:tc>
@@ -23029,11 +23552,58 @@
       </w:pPr>
       <w:r>
         <w:rPr>
-          <w:rFonts w:eastAsia="Times New Roman"/>
-          <w:b w:val="false"/>
-          <w:sz w:val="18"/>
-        </w:rPr>
-        <w:t>Student Signature: __________________________   Date: 03 July 2026</w:t>
+          <w:b w:val="false"/>
+          <w:sz w:val="18"/>
+        </w:rPr>
+        <w:t xml:space="preserve">Student Signature: </w:t>
+      </w:r>
+      <w:r>
+        <w:rPr/>
+        <w:drawing>
+          <wp:inline distT="0" distB="0" distL="0" distR="0">
+            <wp:extent cx="2192655" cy="269875"/>
+            <wp:effectExtent l="0" t="0" r="0" b="0"/>
+            <wp:docPr id="25" name="Image11"/>
+            <wp:cNvGraphicFramePr>
+              <a:graphicFrameLocks xmlns:a="http://schemas.openxmlformats.org/drawingml/2006/main" noChangeAspect="1"/>
+            </wp:cNvGraphicFramePr>
+            <a:graphic xmlns:a="http://schemas.openxmlformats.org/drawingml/2006/main">
+              <a:graphicData uri="http://schemas.openxmlformats.org/drawingml/2006/picture">
+                <pic:pic xmlns:pic="http://schemas.openxmlformats.org/drawingml/2006/picture">
+                  <pic:nvPicPr>
+                    <pic:cNvPr id="25" name="Image11"/>
+                    <pic:cNvPicPr>
+                      <a:picLocks noChangeAspect="1" noChangeArrowheads="1"/>
+                    </pic:cNvPicPr>
+                  </pic:nvPicPr>
+                  <pic:blipFill>
+                    <a:blip r:embed="rId29"/>
+                    <a:stretch>
+                      <a:fillRect/>
+                    </a:stretch>
+                  </pic:blipFill>
+                  <pic:spPr bwMode="auto">
+                    <a:xfrm>
+                      <a:off x="0" y="0"/>
+                      <a:ext cx="2192655" cy="269875"/>
+                    </a:xfrm>
+                    <a:prstGeom prst="rect">
+                      <a:avLst/>
+                    </a:prstGeom>
+                    <a:noFill/>
+                  </pic:spPr>
+                </pic:pic>
+              </a:graphicData>
+            </a:graphic>
+          </wp:inline>
+        </w:drawing>
+      </w:r>
+      <w:r>
+        <w:rPr>
+          <w:b w:val="false"/>
+          <w:sz w:val="18"/>
+        </w:rPr>
+        <w:t xml:space="preserve">   Date: 03 July 2026</w:t>
       </w:r>
     </w:p>
     <w:p>
@@ -23049,7 +23619,7 @@
           <w:b w:val="false"/>
           <w:sz w:val="18"/>
         </w:rPr>
-        <w:t>Industry Mentor / Research Supervisor Remarks: ______________________________________________________</w:t>
+        <w:t>Industry Mentor / Research Supervisor Remarks: Responsive layout improved.</w:t>
       </w:r>
     </w:p>
     <w:p>
@@ -23065,7 +23635,7 @@
           <w:b w:val="false"/>
           <w:sz w:val="18"/>
         </w:rPr>
-        <w:t>Signature: _________________________________   Date: __________________</w:t>
+        <w:t>Signature: ______________________   Name: Mr. Manav Gupta   Date: 03 July 2026</w:t>
       </w:r>
       <w:r>
         <w:br w:type="page"/>
@@ -23914,10 +24484,14 @@
             </w:pPr>
             <w:r>
               <w:rPr>
-                <w:kern w:val="0"/>
-                <w:szCs w:val="22"/>
-                <w:lang w:val="en-US" w:eastAsia="en-US" w:bidi="ar-SA"/>
-              </w:rPr>
+                <w:rFonts w:eastAsia="Times New Roman"/>
+                <w:b w:val="false"/>
+                <w:kern w:val="0"/>
+                <w:sz w:val="17"/>
+                <w:szCs w:val="22"/>
+                <w:lang w:val="en-US" w:eastAsia="en-US" w:bidi="ar-SA"/>
+              </w:rPr>
+              <w:t>Sunil Maggu</w:t>
             </w:r>
           </w:p>
         </w:tc>
@@ -24482,11 +25056,58 @@
       </w:pPr>
       <w:r>
         <w:rPr>
-          <w:rFonts w:eastAsia="Times New Roman"/>
-          <w:b w:val="false"/>
-          <w:sz w:val="18"/>
-        </w:rPr>
-        <w:t>Student Signature: __________________________   Date: 10 July 2026</w:t>
+          <w:b w:val="false"/>
+          <w:sz w:val="18"/>
+        </w:rPr>
+        <w:t xml:space="preserve">Student Signature: </w:t>
+      </w:r>
+      <w:r>
+        <w:rPr/>
+        <w:drawing>
+          <wp:inline distT="0" distB="0" distL="0" distR="0">
+            <wp:extent cx="2192655" cy="269875"/>
+            <wp:effectExtent l="0" t="0" r="0" b="0"/>
+            <wp:docPr id="26" name="Image12"/>
+            <wp:cNvGraphicFramePr>
+              <a:graphicFrameLocks xmlns:a="http://schemas.openxmlformats.org/drawingml/2006/main" noChangeAspect="1"/>
+            </wp:cNvGraphicFramePr>
+            <a:graphic xmlns:a="http://schemas.openxmlformats.org/drawingml/2006/main">
+              <a:graphicData uri="http://schemas.openxmlformats.org/drawingml/2006/picture">
+                <pic:pic xmlns:pic="http://schemas.openxmlformats.org/drawingml/2006/picture">
+                  <pic:nvPicPr>
+                    <pic:cNvPr id="26" name="Image12"/>
+                    <pic:cNvPicPr>
+                      <a:picLocks noChangeAspect="1" noChangeArrowheads="1"/>
+                    </pic:cNvPicPr>
+                  </pic:nvPicPr>
+                  <pic:blipFill>
+                    <a:blip r:embed="rId30"/>
+                    <a:stretch>
+                      <a:fillRect/>
+                    </a:stretch>
+                  </pic:blipFill>
+                  <pic:spPr bwMode="auto">
+                    <a:xfrm>
+                      <a:off x="0" y="0"/>
+                      <a:ext cx="2192655" cy="269875"/>
+                    </a:xfrm>
+                    <a:prstGeom prst="rect">
+                      <a:avLst/>
+                    </a:prstGeom>
+                    <a:noFill/>
+                  </pic:spPr>
+                </pic:pic>
+              </a:graphicData>
+            </a:graphic>
+          </wp:inline>
+        </w:drawing>
+      </w:r>
+      <w:r>
+        <w:rPr>
+          <w:b w:val="false"/>
+          <w:sz w:val="18"/>
+        </w:rPr>
+        <w:t xml:space="preserve">   Date: 10 July 2026</w:t>
       </w:r>
     </w:p>
     <w:p>
@@ -24502,7 +25123,7 @@
           <w:b w:val="false"/>
           <w:sz w:val="18"/>
         </w:rPr>
-        <w:t>Industry Mentor / Research Supervisor Remarks: ______________________________________________________</w:t>
+        <w:t>Industry Mentor / Research Supervisor Remarks: Admin view delivered as required.</w:t>
       </w:r>
     </w:p>
     <w:p>
@@ -24518,7 +25139,7 @@
           <w:b w:val="false"/>
           <w:sz w:val="18"/>
         </w:rPr>
-        <w:t>Signature: _________________________________   Date: __________________</w:t>
+        <w:t>Signature: ______________________   Name: Mr. Manav Gupta   Date: 10 July 2026</w:t>
       </w:r>
       <w:r>
         <w:br w:type="page"/>
@@ -25367,10 +25988,14 @@
             </w:pPr>
             <w:r>
               <w:rPr>
-                <w:kern w:val="0"/>
-                <w:szCs w:val="22"/>
-                <w:lang w:val="en-US" w:eastAsia="en-US" w:bidi="ar-SA"/>
-              </w:rPr>
+                <w:rFonts w:eastAsia="Times New Roman"/>
+                <w:b w:val="false"/>
+                <w:kern w:val="0"/>
+                <w:sz w:val="17"/>
+                <w:szCs w:val="22"/>
+                <w:lang w:val="en-US" w:eastAsia="en-US" w:bidi="ar-SA"/>
+              </w:rPr>
+              <w:t>Sunil Maggu</w:t>
             </w:r>
           </w:p>
         </w:tc>
@@ -25935,11 +26560,58 @@
       </w:pPr>
       <w:r>
         <w:rPr>
-          <w:rFonts w:eastAsia="Times New Roman"/>
-          <w:b w:val="false"/>
-          <w:sz w:val="18"/>
-        </w:rPr>
-        <w:t>Student Signature: __________________________   Date: 17 July 2026</w:t>
+          <w:b w:val="false"/>
+          <w:sz w:val="18"/>
+        </w:rPr>
+        <w:t xml:space="preserve">Student Signature: </w:t>
+      </w:r>
+      <w:r>
+        <w:rPr/>
+        <w:drawing>
+          <wp:inline distT="0" distB="0" distL="0" distR="0">
+            <wp:extent cx="2192655" cy="269875"/>
+            <wp:effectExtent l="0" t="0" r="0" b="0"/>
+            <wp:docPr id="27" name="Image13"/>
+            <wp:cNvGraphicFramePr>
+              <a:graphicFrameLocks xmlns:a="http://schemas.openxmlformats.org/drawingml/2006/main" noChangeAspect="1"/>
+            </wp:cNvGraphicFramePr>
+            <a:graphic xmlns:a="http://schemas.openxmlformats.org/drawingml/2006/main">
+              <a:graphicData uri="http://schemas.openxmlformats.org/drawingml/2006/picture">
+                <pic:pic xmlns:pic="http://schemas.openxmlformats.org/drawingml/2006/picture">
+                  <pic:nvPicPr>
+                    <pic:cNvPr id="27" name="Image13"/>
+                    <pic:cNvPicPr>
+                      <a:picLocks noChangeAspect="1" noChangeArrowheads="1"/>
+                    </pic:cNvPicPr>
+                  </pic:nvPicPr>
+                  <pic:blipFill>
+                    <a:blip r:embed="rId31"/>
+                    <a:stretch>
+                      <a:fillRect/>
+                    </a:stretch>
+                  </pic:blipFill>
+                  <pic:spPr bwMode="auto">
+                    <a:xfrm>
+                      <a:off x="0" y="0"/>
+                      <a:ext cx="2192655" cy="269875"/>
+                    </a:xfrm>
+                    <a:prstGeom prst="rect">
+                      <a:avLst/>
+                    </a:prstGeom>
+                    <a:noFill/>
+                  </pic:spPr>
+                </pic:pic>
+              </a:graphicData>
+            </a:graphic>
+          </wp:inline>
+        </w:drawing>
+      </w:r>
+      <w:r>
+        <w:rPr>
+          <w:b w:val="false"/>
+          <w:sz w:val="18"/>
+        </w:rPr>
+        <w:t xml:space="preserve">   Date: 17 July 2026</w:t>
       </w:r>
     </w:p>
     <w:p>
@@ -25955,7 +26627,7 @@
           <w:b w:val="false"/>
           <w:sz w:val="18"/>
         </w:rPr>
-        <w:t>Industry Mentor / Research Supervisor Remarks: ______________________________________________________</w:t>
+        <w:t>Industry Mentor / Research Supervisor Remarks: System Information work satisfactory.</w:t>
       </w:r>
     </w:p>
     <w:p>
@@ -25971,7 +26643,7 @@
           <w:b w:val="false"/>
           <w:sz w:val="18"/>
         </w:rPr>
-        <w:t>Signature: _________________________________   Date: __________________</w:t>
+        <w:t>Signature: ______________________   Name: Mr. Manav Gupta   Date: 17 July 2026</w:t>
       </w:r>
       <w:r>
         <w:br w:type="page"/>
@@ -26820,10 +27492,14 @@
             </w:pPr>
             <w:r>
               <w:rPr>
-                <w:kern w:val="0"/>
-                <w:szCs w:val="22"/>
-                <w:lang w:val="en-US" w:eastAsia="en-US" w:bidi="ar-SA"/>
-              </w:rPr>
+                <w:rFonts w:eastAsia="Times New Roman"/>
+                <w:b w:val="false"/>
+                <w:kern w:val="0"/>
+                <w:sz w:val="17"/>
+                <w:szCs w:val="22"/>
+                <w:lang w:val="en-US" w:eastAsia="en-US" w:bidi="ar-SA"/>
+              </w:rPr>
+              <w:t>Sunil Maggu</w:t>
             </w:r>
           </w:p>
         </w:tc>
@@ -27388,11 +28064,58 @@
       </w:pPr>
       <w:r>
         <w:rPr>
-          <w:rFonts w:eastAsia="Times New Roman"/>
-          <w:b w:val="false"/>
-          <w:sz w:val="18"/>
-        </w:rPr>
-        <w:t>Student Signature: __________________________   Date: 24 July 2026</w:t>
+          <w:b w:val="false"/>
+          <w:sz w:val="18"/>
+        </w:rPr>
+        <w:t xml:space="preserve">Student Signature: </w:t>
+      </w:r>
+      <w:r>
+        <w:rPr/>
+        <w:drawing>
+          <wp:inline distT="0" distB="0" distL="0" distR="0">
+            <wp:extent cx="2192655" cy="269875"/>
+            <wp:effectExtent l="0" t="0" r="0" b="0"/>
+            <wp:docPr id="28" name="Image14"/>
+            <wp:cNvGraphicFramePr>
+              <a:graphicFrameLocks xmlns:a="http://schemas.openxmlformats.org/drawingml/2006/main" noChangeAspect="1"/>
+            </wp:cNvGraphicFramePr>
+            <a:graphic xmlns:a="http://schemas.openxmlformats.org/drawingml/2006/main">
+              <a:graphicData uri="http://schemas.openxmlformats.org/drawingml/2006/picture">
+                <pic:pic xmlns:pic="http://schemas.openxmlformats.org/drawingml/2006/picture">
+                  <pic:nvPicPr>
+                    <pic:cNvPr id="28" name="Image14"/>
+                    <pic:cNvPicPr>
+                      <a:picLocks noChangeAspect="1" noChangeArrowheads="1"/>
+                    </pic:cNvPicPr>
+                  </pic:nvPicPr>
+                  <pic:blipFill>
+                    <a:blip r:embed="rId32"/>
+                    <a:stretch>
+                      <a:fillRect/>
+                    </a:stretch>
+                  </pic:blipFill>
+                  <pic:spPr bwMode="auto">
+                    <a:xfrm>
+                      <a:off x="0" y="0"/>
+                      <a:ext cx="2192655" cy="269875"/>
+                    </a:xfrm>
+                    <a:prstGeom prst="rect">
+                      <a:avLst/>
+                    </a:prstGeom>
+                    <a:noFill/>
+                  </pic:spPr>
+                </pic:pic>
+              </a:graphicData>
+            </a:graphic>
+          </wp:inline>
+        </w:drawing>
+      </w:r>
+      <w:r>
+        <w:rPr>
+          <w:b w:val="false"/>
+          <w:sz w:val="18"/>
+        </w:rPr>
+        <w:t xml:space="preserve">   Date: 24 July 2026</w:t>
       </w:r>
     </w:p>
     <w:p>
@@ -27408,7 +28131,7 @@
           <w:b w:val="false"/>
           <w:sz w:val="18"/>
         </w:rPr>
-        <w:t>Industry Mentor / Research Supervisor Remarks: ______________________________________________________</w:t>
+        <w:t>Industry Mentor / Research Supervisor Remarks: Alarm views consistent with portal design.</w:t>
       </w:r>
     </w:p>
     <w:p>
@@ -27424,7 +28147,7 @@
           <w:b w:val="false"/>
           <w:sz w:val="18"/>
         </w:rPr>
-        <w:t>Signature: _________________________________   Date: __________________</w:t>
+        <w:t>Signature: ______________________   Name: Mr. Manav Gupta   Date: 24 July 2026</w:t>
       </w:r>
       <w:r>
         <w:br w:type="page"/>
@@ -28273,10 +28996,14 @@
             </w:pPr>
             <w:r>
               <w:rPr>
-                <w:kern w:val="0"/>
-                <w:szCs w:val="22"/>
-                <w:lang w:val="en-US" w:eastAsia="en-US" w:bidi="ar-SA"/>
-              </w:rPr>
+                <w:rFonts w:eastAsia="Times New Roman"/>
+                <w:b w:val="false"/>
+                <w:kern w:val="0"/>
+                <w:sz w:val="17"/>
+                <w:szCs w:val="22"/>
+                <w:lang w:val="en-US" w:eastAsia="en-US" w:bidi="ar-SA"/>
+              </w:rPr>
+              <w:t>Sunil Maggu</w:t>
             </w:r>
           </w:p>
         </w:tc>
@@ -28841,11 +29568,58 @@
       </w:pPr>
       <w:r>
         <w:rPr>
-          <w:rFonts w:eastAsia="Times New Roman"/>
-          <w:b w:val="false"/>
-          <w:sz w:val="18"/>
-        </w:rPr>
-        <w:t>Student Signature: __________________________   Date: 31 July 2026</w:t>
+          <w:b w:val="false"/>
+          <w:sz w:val="18"/>
+        </w:rPr>
+        <w:t xml:space="preserve">Student Signature: </w:t>
+      </w:r>
+      <w:r>
+        <w:rPr/>
+        <w:drawing>
+          <wp:inline distT="0" distB="0" distL="0" distR="0">
+            <wp:extent cx="2192655" cy="269875"/>
+            <wp:effectExtent l="0" t="0" r="0" b="0"/>
+            <wp:docPr id="29" name="Image15"/>
+            <wp:cNvGraphicFramePr>
+              <a:graphicFrameLocks xmlns:a="http://schemas.openxmlformats.org/drawingml/2006/main" noChangeAspect="1"/>
+            </wp:cNvGraphicFramePr>
+            <a:graphic xmlns:a="http://schemas.openxmlformats.org/drawingml/2006/main">
+              <a:graphicData uri="http://schemas.openxmlformats.org/drawingml/2006/picture">
+                <pic:pic xmlns:pic="http://schemas.openxmlformats.org/drawingml/2006/picture">
+                  <pic:nvPicPr>
+                    <pic:cNvPr id="29" name="Image15"/>
+                    <pic:cNvPicPr>
+                      <a:picLocks noChangeAspect="1" noChangeArrowheads="1"/>
+                    </pic:cNvPicPr>
+                  </pic:nvPicPr>
+                  <pic:blipFill>
+                    <a:blip r:embed="rId33"/>
+                    <a:stretch>
+                      <a:fillRect/>
+                    </a:stretch>
+                  </pic:blipFill>
+                  <pic:spPr bwMode="auto">
+                    <a:xfrm>
+                      <a:off x="0" y="0"/>
+                      <a:ext cx="2192655" cy="269875"/>
+                    </a:xfrm>
+                    <a:prstGeom prst="rect">
+                      <a:avLst/>
+                    </a:prstGeom>
+                    <a:noFill/>
+                  </pic:spPr>
+                </pic:pic>
+              </a:graphicData>
+            </a:graphic>
+          </wp:inline>
+        </w:drawing>
+      </w:r>
+      <w:r>
+        <w:rPr>
+          <w:b w:val="false"/>
+          <w:sz w:val="18"/>
+        </w:rPr>
+        <w:t xml:space="preserve">   Date: 31 July 2026</w:t>
       </w:r>
     </w:p>
     <w:p>
@@ -28861,7 +29635,7 @@
           <w:b w:val="false"/>
           <w:sz w:val="18"/>
         </w:rPr>
-        <w:t>Industry Mentor / Research Supervisor Remarks: ______________________________________________________</w:t>
+        <w:t>Industry Mentor / Research Supervisor Remarks: Good progress; continuing part-time in August.</w:t>
       </w:r>
     </w:p>
     <w:p>
@@ -28877,7 +29651,7 @@
           <w:b w:val="false"/>
           <w:sz w:val="18"/>
         </w:rPr>
-        <w:t>Signature: _________________________________   Date: __________________</w:t>
+        <w:t>Signature: ______________________   Name: Mr. Manav Gupta   Date: 31 July 2026</w:t>
       </w:r>
       <w:r>
         <w:br w:type="page"/>
@@ -29726,10 +30500,14 @@
             </w:pPr>
             <w:r>
               <w:rPr>
-                <w:kern w:val="0"/>
-                <w:szCs w:val="22"/>
-                <w:lang w:val="en-US" w:eastAsia="en-US" w:bidi="ar-SA"/>
-              </w:rPr>
+                <w:rFonts w:eastAsia="Times New Roman"/>
+                <w:b w:val="false"/>
+                <w:kern w:val="0"/>
+                <w:sz w:val="17"/>
+                <w:szCs w:val="22"/>
+                <w:lang w:val="en-US" w:eastAsia="en-US" w:bidi="ar-SA"/>
+              </w:rPr>
+              <w:t>Sunil Maggu</w:t>
             </w:r>
           </w:p>
         </w:tc>
@@ -30294,11 +31072,58 @@
       </w:pPr>
       <w:r>
         <w:rPr>
-          <w:rFonts w:eastAsia="Times New Roman"/>
-          <w:b w:val="false"/>
-          <w:sz w:val="18"/>
-        </w:rPr>
-        <w:t>Student Signature: __________________________   Date: 07 August 2026</w:t>
+          <w:b w:val="false"/>
+          <w:sz w:val="18"/>
+        </w:rPr>
+        <w:t xml:space="preserve">Student Signature: </w:t>
+      </w:r>
+      <w:r>
+        <w:rPr/>
+        <w:drawing>
+          <wp:inline distT="0" distB="0" distL="0" distR="0">
+            <wp:extent cx="2192655" cy="269875"/>
+            <wp:effectExtent l="0" t="0" r="0" b="0"/>
+            <wp:docPr id="30" name="Image16"/>
+            <wp:cNvGraphicFramePr>
+              <a:graphicFrameLocks xmlns:a="http://schemas.openxmlformats.org/drawingml/2006/main" noChangeAspect="1"/>
+            </wp:cNvGraphicFramePr>
+            <a:graphic xmlns:a="http://schemas.openxmlformats.org/drawingml/2006/main">
+              <a:graphicData uri="http://schemas.openxmlformats.org/drawingml/2006/picture">
+                <pic:pic xmlns:pic="http://schemas.openxmlformats.org/drawingml/2006/picture">
+                  <pic:nvPicPr>
+                    <pic:cNvPr id="30" name="Image16"/>
+                    <pic:cNvPicPr>
+                      <a:picLocks noChangeAspect="1" noChangeArrowheads="1"/>
+                    </pic:cNvPicPr>
+                  </pic:nvPicPr>
+                  <pic:blipFill>
+                    <a:blip r:embed="rId34"/>
+                    <a:stretch>
+                      <a:fillRect/>
+                    </a:stretch>
+                  </pic:blipFill>
+                  <pic:spPr bwMode="auto">
+                    <a:xfrm>
+                      <a:off x="0" y="0"/>
+                      <a:ext cx="2192655" cy="269875"/>
+                    </a:xfrm>
+                    <a:prstGeom prst="rect">
+                      <a:avLst/>
+                    </a:prstGeom>
+                    <a:noFill/>
+                  </pic:spPr>
+                </pic:pic>
+              </a:graphicData>
+            </a:graphic>
+          </wp:inline>
+        </w:drawing>
+      </w:r>
+      <w:r>
+        <w:rPr>
+          <w:b w:val="false"/>
+          <w:sz w:val="18"/>
+        </w:rPr>
+        <w:t xml:space="preserve">   Date: 07 August 2026</w:t>
       </w:r>
     </w:p>
     <w:p>
@@ -30314,7 +31139,7 @@
           <w:b w:val="false"/>
           <w:sz w:val="18"/>
         </w:rPr>
-        <w:t>Industry Mentor / Research Supervisor Remarks: ______________________________________________________</w:t>
+        <w:t>Industry Mentor / Research Supervisor Remarks: Solid data-handling fixes.</w:t>
       </w:r>
     </w:p>
     <w:p>
@@ -30330,7 +31155,7 @@
           <w:b w:val="false"/>
           <w:sz w:val="18"/>
         </w:rPr>
-        <w:t>Signature: _________________________________   Date: __________________</w:t>
+        <w:t>Signature: ______________________   Name: Mr. Manav Gupta   Date: 07 August 2026</w:t>
       </w:r>
       <w:r>
         <w:br w:type="page"/>
@@ -31179,10 +32004,14 @@
             </w:pPr>
             <w:r>
               <w:rPr>
-                <w:kern w:val="0"/>
-                <w:szCs w:val="22"/>
-                <w:lang w:val="en-US" w:eastAsia="en-US" w:bidi="ar-SA"/>
-              </w:rPr>
+                <w:rFonts w:eastAsia="Times New Roman"/>
+                <w:b w:val="false"/>
+                <w:kern w:val="0"/>
+                <w:sz w:val="17"/>
+                <w:szCs w:val="22"/>
+                <w:lang w:val="en-US" w:eastAsia="en-US" w:bidi="ar-SA"/>
+              </w:rPr>
+              <w:t>Sunil Maggu</w:t>
             </w:r>
           </w:p>
         </w:tc>
@@ -31747,11 +32576,58 @@
       </w:pPr>
       <w:r>
         <w:rPr>
-          <w:rFonts w:eastAsia="Times New Roman"/>
-          <w:b w:val="false"/>
-          <w:sz w:val="18"/>
-        </w:rPr>
-        <w:t>Student Signature: __________________________   Date: 14 August 2026</w:t>
+          <w:b w:val="false"/>
+          <w:sz w:val="18"/>
+        </w:rPr>
+        <w:t xml:space="preserve">Student Signature: </w:t>
+      </w:r>
+      <w:r>
+        <w:rPr/>
+        <w:drawing>
+          <wp:inline distT="0" distB="0" distL="0" distR="0">
+            <wp:extent cx="2192655" cy="269875"/>
+            <wp:effectExtent l="0" t="0" r="0" b="0"/>
+            <wp:docPr id="31" name="Image17"/>
+            <wp:cNvGraphicFramePr>
+              <a:graphicFrameLocks xmlns:a="http://schemas.openxmlformats.org/drawingml/2006/main" noChangeAspect="1"/>
+            </wp:cNvGraphicFramePr>
+            <a:graphic xmlns:a="http://schemas.openxmlformats.org/drawingml/2006/main">
+              <a:graphicData uri="http://schemas.openxmlformats.org/drawingml/2006/picture">
+                <pic:pic xmlns:pic="http://schemas.openxmlformats.org/drawingml/2006/picture">
+                  <pic:nvPicPr>
+                    <pic:cNvPr id="31" name="Image17"/>
+                    <pic:cNvPicPr>
+                      <a:picLocks noChangeAspect="1" noChangeArrowheads="1"/>
+                    </pic:cNvPicPr>
+                  </pic:nvPicPr>
+                  <pic:blipFill>
+                    <a:blip r:embed="rId35"/>
+                    <a:stretch>
+                      <a:fillRect/>
+                    </a:stretch>
+                  </pic:blipFill>
+                  <pic:spPr bwMode="auto">
+                    <a:xfrm>
+                      <a:off x="0" y="0"/>
+                      <a:ext cx="2192655" cy="269875"/>
+                    </a:xfrm>
+                    <a:prstGeom prst="rect">
+                      <a:avLst/>
+                    </a:prstGeom>
+                    <a:noFill/>
+                  </pic:spPr>
+                </pic:pic>
+              </a:graphicData>
+            </a:graphic>
+          </wp:inline>
+        </w:drawing>
+      </w:r>
+      <w:r>
+        <w:rPr>
+          <w:b w:val="false"/>
+          <w:sz w:val="18"/>
+        </w:rPr>
+        <w:t xml:space="preserve">   Date: 14 August 2026</w:t>
       </w:r>
     </w:p>
     <w:p>
@@ -31767,7 +32643,7 @@
           <w:b w:val="false"/>
           <w:sz w:val="18"/>
         </w:rPr>
-        <w:t>Industry Mentor / Research Supervisor Remarks: ______________________________________________________</w:t>
+        <w:t>Industry Mentor / Research Supervisor Remarks: Spatial Heatmap improvements integrated to staging.</w:t>
       </w:r>
     </w:p>
     <w:p>
@@ -31783,7 +32659,7 @@
           <w:b w:val="false"/>
           <w:sz w:val="18"/>
         </w:rPr>
-        <w:t>Signature: _________________________________   Date: __________________</w:t>
+        <w:t>Signature: ______________________   Name: Mr. Manav Gupta   Date: 14 August 2026</w:t>
       </w:r>
       <w:r>
         <w:br w:type="page"/>
@@ -32632,10 +33508,14 @@
             </w:pPr>
             <w:r>
               <w:rPr>
-                <w:kern w:val="0"/>
-                <w:szCs w:val="22"/>
-                <w:lang w:val="en-US" w:eastAsia="en-US" w:bidi="ar-SA"/>
-              </w:rPr>
+                <w:rFonts w:eastAsia="Times New Roman"/>
+                <w:b w:val="false"/>
+                <w:kern w:val="0"/>
+                <w:sz w:val="17"/>
+                <w:szCs w:val="22"/>
+                <w:lang w:val="en-US" w:eastAsia="en-US" w:bidi="ar-SA"/>
+              </w:rPr>
+              <w:t>Sunil Maggu</w:t>
             </w:r>
           </w:p>
         </w:tc>
@@ -33200,11 +34080,58 @@
       </w:pPr>
       <w:r>
         <w:rPr>
-          <w:rFonts w:eastAsia="Times New Roman"/>
-          <w:b w:val="false"/>
-          <w:sz w:val="18"/>
-        </w:rPr>
-        <w:t>Student Signature: __________________________   Date: 21 August 2026</w:t>
+          <w:b w:val="false"/>
+          <w:sz w:val="18"/>
+        </w:rPr>
+        <w:t xml:space="preserve">Student Signature: </w:t>
+      </w:r>
+      <w:r>
+        <w:rPr/>
+        <w:drawing>
+          <wp:inline distT="0" distB="0" distL="0" distR="0">
+            <wp:extent cx="2192655" cy="269875"/>
+            <wp:effectExtent l="0" t="0" r="0" b="0"/>
+            <wp:docPr id="32" name="Image18"/>
+            <wp:cNvGraphicFramePr>
+              <a:graphicFrameLocks xmlns:a="http://schemas.openxmlformats.org/drawingml/2006/main" noChangeAspect="1"/>
+            </wp:cNvGraphicFramePr>
+            <a:graphic xmlns:a="http://schemas.openxmlformats.org/drawingml/2006/main">
+              <a:graphicData uri="http://schemas.openxmlformats.org/drawingml/2006/picture">
+                <pic:pic xmlns:pic="http://schemas.openxmlformats.org/drawingml/2006/picture">
+                  <pic:nvPicPr>
+                    <pic:cNvPr id="32" name="Image18"/>
+                    <pic:cNvPicPr>
+                      <a:picLocks noChangeAspect="1" noChangeArrowheads="1"/>
+                    </pic:cNvPicPr>
+                  </pic:nvPicPr>
+                  <pic:blipFill>
+                    <a:blip r:embed="rId36"/>
+                    <a:stretch>
+                      <a:fillRect/>
+                    </a:stretch>
+                  </pic:blipFill>
+                  <pic:spPr bwMode="auto">
+                    <a:xfrm>
+                      <a:off x="0" y="0"/>
+                      <a:ext cx="2192655" cy="269875"/>
+                    </a:xfrm>
+                    <a:prstGeom prst="rect">
+                      <a:avLst/>
+                    </a:prstGeom>
+                    <a:noFill/>
+                  </pic:spPr>
+                </pic:pic>
+              </a:graphicData>
+            </a:graphic>
+          </wp:inline>
+        </w:drawing>
+      </w:r>
+      <w:r>
+        <w:rPr>
+          <w:b w:val="false"/>
+          <w:sz w:val="18"/>
+        </w:rPr>
+        <w:t xml:space="preserve">   Date: 21 August 2026</w:t>
       </w:r>
     </w:p>
     <w:p>
@@ -33220,7 +34147,7 @@
           <w:b w:val="false"/>
           <w:sz w:val="18"/>
         </w:rPr>
-        <w:t>Industry Mentor / Research Supervisor Remarks: ______________________________________________________</w:t>
+        <w:t>Industry Mentor / Research Supervisor Remarks: Good performance optimisation work.</w:t>
       </w:r>
     </w:p>
     <w:p>
@@ -33236,7 +34163,7 @@
           <w:b w:val="false"/>
           <w:sz w:val="18"/>
         </w:rPr>
-        <w:t>Signature: _________________________________   Date: __________________</w:t>
+        <w:t>Signature: ______________________   Name: Mr. Manav Gupta   Date: 21 August 2026</w:t>
       </w:r>
       <w:r>
         <w:br w:type="page"/>
@@ -34085,10 +35012,14 @@
             </w:pPr>
             <w:r>
               <w:rPr>
-                <w:kern w:val="0"/>
-                <w:szCs w:val="22"/>
-                <w:lang w:val="en-US" w:eastAsia="en-US" w:bidi="ar-SA"/>
-              </w:rPr>
+                <w:rFonts w:eastAsia="Times New Roman"/>
+                <w:b w:val="false"/>
+                <w:kern w:val="0"/>
+                <w:sz w:val="17"/>
+                <w:szCs w:val="22"/>
+                <w:lang w:val="en-US" w:eastAsia="en-US" w:bidi="ar-SA"/>
+              </w:rPr>
+              <w:t>Sunil Maggu</w:t>
             </w:r>
           </w:p>
         </w:tc>
@@ -34653,11 +35584,58 @@
       </w:pPr>
       <w:r>
         <w:rPr>
-          <w:rFonts w:eastAsia="Times New Roman"/>
-          <w:b w:val="false"/>
-          <w:sz w:val="18"/>
-        </w:rPr>
-        <w:t>Student Signature: __________________________   Date: 31 August 2026</w:t>
+          <w:b w:val="false"/>
+          <w:sz w:val="18"/>
+        </w:rPr>
+        <w:t xml:space="preserve">Student Signature: </w:t>
+      </w:r>
+      <w:r>
+        <w:rPr/>
+        <w:drawing>
+          <wp:inline distT="0" distB="0" distL="0" distR="0">
+            <wp:extent cx="2192655" cy="269875"/>
+            <wp:effectExtent l="0" t="0" r="0" b="0"/>
+            <wp:docPr id="33" name="Image19"/>
+            <wp:cNvGraphicFramePr>
+              <a:graphicFrameLocks xmlns:a="http://schemas.openxmlformats.org/drawingml/2006/main" noChangeAspect="1"/>
+            </wp:cNvGraphicFramePr>
+            <a:graphic xmlns:a="http://schemas.openxmlformats.org/drawingml/2006/main">
+              <a:graphicData uri="http://schemas.openxmlformats.org/drawingml/2006/picture">
+                <pic:pic xmlns:pic="http://schemas.openxmlformats.org/drawingml/2006/picture">
+                  <pic:nvPicPr>
+                    <pic:cNvPr id="33" name="Image19"/>
+                    <pic:cNvPicPr>
+                      <a:picLocks noChangeAspect="1" noChangeArrowheads="1"/>
+                    </pic:cNvPicPr>
+                  </pic:nvPicPr>
+                  <pic:blipFill>
+                    <a:blip r:embed="rId37"/>
+                    <a:stretch>
+                      <a:fillRect/>
+                    </a:stretch>
+                  </pic:blipFill>
+                  <pic:spPr bwMode="auto">
+                    <a:xfrm>
+                      <a:off x="0" y="0"/>
+                      <a:ext cx="2192655" cy="269875"/>
+                    </a:xfrm>
+                    <a:prstGeom prst="rect">
+                      <a:avLst/>
+                    </a:prstGeom>
+                    <a:noFill/>
+                  </pic:spPr>
+                </pic:pic>
+              </a:graphicData>
+            </a:graphic>
+          </wp:inline>
+        </w:drawing>
+      </w:r>
+      <w:r>
+        <w:rPr>
+          <w:b w:val="false"/>
+          <w:sz w:val="18"/>
+        </w:rPr>
+        <w:t xml:space="preserve">   Date: 31 August 2026</w:t>
       </w:r>
     </w:p>
     <w:p>
@@ -34673,7 +35651,7 @@
           <w:b w:val="false"/>
           <w:sz w:val="18"/>
         </w:rPr>
-        <w:t>Industry Mentor / Research Supervisor Remarks: ______________________________________________________</w:t>
+        <w:t>Industry Mentor / Research Supervisor Remarks: Refactor and tests completed; internship completed successfully.</w:t>
       </w:r>
     </w:p>
     <w:p>
@@ -34689,7 +35667,7 @@
           <w:b w:val="false"/>
           <w:sz w:val="18"/>
         </w:rPr>
-        <w:t>Signature: _________________________________   Date: __________________</w:t>
+        <w:t>Signature: ______________________   Name: Mr. Manav Gupta   Date: 31 August 2026</w:t>
       </w:r>
     </w:p>
     <w:p>
@@ -34815,7 +35793,7 @@
         <w:rPr>
           <w:rFonts w:eastAsia="Times New Roman"/>
           <w:b/>
-          <w:sz w:val="23"/>
+          <w:sz w:val="22"/>
         </w:rPr>
         <w:t>Dear Industry Mentor / Research Supervisor,</w:t>
       </w:r>
@@ -34831,7 +35809,7 @@
         <w:rPr>
           <w:rFonts w:eastAsia="Times New Roman"/>
           <w:b w:val="false"/>
-          <w:sz w:val="21"/>
+          <w:sz w:val="20"/>
         </w:rPr>
         <w:t>Thank you for supporting our Programme by offering an Industrial Training placement. It represents an important part of our students’ professional training. To complete the process, we would appreciate it if you would complete this short assessment of the student.</w:t>
       </w:r>
@@ -34897,7 +35875,7 @@
                 <w:rFonts w:eastAsia="Times New Roman"/>
                 <w:b/>
                 <w:kern w:val="0"/>
-                <w:sz w:val="19"/>
+                <w:sz w:val="18"/>
                 <w:szCs w:val="22"/>
                 <w:lang w:val="en-US" w:eastAsia="en-US" w:bidi="ar-SA"/>
               </w:rPr>
@@ -34928,7 +35906,7 @@
                 <w:rFonts w:eastAsia="Times New Roman"/>
                 <w:b/>
                 <w:kern w:val="0"/>
-                <w:sz w:val="19"/>
+                <w:sz w:val="18"/>
                 <w:szCs w:val="22"/>
                 <w:lang w:val="en-US" w:eastAsia="en-US" w:bidi="ar-SA"/>
               </w:rPr>
@@ -34962,7 +35940,7 @@
                 <w:rFonts w:eastAsia="Times New Roman"/>
                 <w:b w:val="false"/>
                 <w:kern w:val="0"/>
-                <w:sz w:val="19"/>
+                <w:sz w:val="18"/>
                 <w:szCs w:val="22"/>
                 <w:lang w:val="en-US" w:eastAsia="en-US" w:bidi="ar-SA"/>
               </w:rPr>
@@ -34993,7 +35971,7 @@
                 <w:rFonts w:eastAsia="Times New Roman"/>
                 <w:b w:val="false"/>
                 <w:kern w:val="0"/>
-                <w:sz w:val="19"/>
+                <w:sz w:val="18"/>
                 <w:szCs w:val="22"/>
                 <w:lang w:val="en-US" w:eastAsia="en-US" w:bidi="ar-SA"/>
               </w:rPr>
@@ -35027,7 +36005,7 @@
                 <w:rFonts w:eastAsia="Times New Roman"/>
                 <w:b w:val="false"/>
                 <w:kern w:val="0"/>
-                <w:sz w:val="19"/>
+                <w:sz w:val="18"/>
                 <w:szCs w:val="22"/>
                 <w:lang w:val="en-US" w:eastAsia="en-US" w:bidi="ar-SA"/>
               </w:rPr>
@@ -35058,7 +36036,7 @@
                 <w:rFonts w:eastAsia="Times New Roman"/>
                 <w:b w:val="false"/>
                 <w:kern w:val="0"/>
-                <w:sz w:val="19"/>
+                <w:sz w:val="18"/>
                 <w:szCs w:val="22"/>
                 <w:lang w:val="en-US" w:eastAsia="en-US" w:bidi="ar-SA"/>
               </w:rPr>
@@ -35092,7 +36070,7 @@
                 <w:rFonts w:eastAsia="Times New Roman"/>
                 <w:b w:val="false"/>
                 <w:kern w:val="0"/>
-                <w:sz w:val="19"/>
+                <w:sz w:val="18"/>
                 <w:szCs w:val="22"/>
                 <w:lang w:val="en-US" w:eastAsia="en-US" w:bidi="ar-SA"/>
               </w:rPr>
@@ -35123,7 +36101,7 @@
                 <w:rFonts w:eastAsia="Times New Roman"/>
                 <w:b w:val="false"/>
                 <w:kern w:val="0"/>
-                <w:sz w:val="19"/>
+                <w:sz w:val="18"/>
                 <w:szCs w:val="22"/>
                 <w:lang w:val="en-US" w:eastAsia="en-US" w:bidi="ar-SA"/>
               </w:rPr>
@@ -35157,7 +36135,7 @@
                 <w:rFonts w:eastAsia="Times New Roman"/>
                 <w:b w:val="false"/>
                 <w:kern w:val="0"/>
-                <w:sz w:val="19"/>
+                <w:sz w:val="18"/>
                 <w:szCs w:val="22"/>
                 <w:lang w:val="en-US" w:eastAsia="en-US" w:bidi="ar-SA"/>
               </w:rPr>
@@ -35188,7 +36166,7 @@
                 <w:rFonts w:eastAsia="Times New Roman"/>
                 <w:b w:val="false"/>
                 <w:kern w:val="0"/>
-                <w:sz w:val="19"/>
+                <w:sz w:val="18"/>
                 <w:szCs w:val="22"/>
                 <w:lang w:val="en-US" w:eastAsia="en-US" w:bidi="ar-SA"/>
               </w:rPr>
@@ -35226,7 +36204,7 @@
         <w:rPr>
           <w:rFonts w:eastAsia="Times New Roman"/>
           <w:b w:val="false"/>
-          <w:sz w:val="19"/>
+          <w:sz w:val="18"/>
         </w:rPr>
         <w:t>Please check (✔) the box that best reflects the intern's traits during their tenure.</w:t>
       </w:r>
@@ -35278,7 +36256,7 @@
                 <w:rFonts w:eastAsia="Times New Roman"/>
                 <w:b/>
                 <w:kern w:val="0"/>
-                <w:sz w:val="18"/>
+                <w:sz w:val="17"/>
                 <w:szCs w:val="22"/>
                 <w:lang w:val="en-US" w:eastAsia="en-US" w:bidi="ar-SA"/>
               </w:rPr>
@@ -35309,7 +36287,7 @@
                 <w:rFonts w:eastAsia="Times New Roman"/>
                 <w:b/>
                 <w:kern w:val="0"/>
-                <w:sz w:val="18"/>
+                <w:sz w:val="17"/>
                 <w:szCs w:val="22"/>
                 <w:lang w:val="en-US" w:eastAsia="en-US" w:bidi="ar-SA"/>
               </w:rPr>
@@ -35340,7 +36318,7 @@
                 <w:rFonts w:eastAsia="Times New Roman"/>
                 <w:b/>
                 <w:kern w:val="0"/>
-                <w:sz w:val="18"/>
+                <w:sz w:val="17"/>
                 <w:szCs w:val="22"/>
                 <w:lang w:val="en-US" w:eastAsia="en-US" w:bidi="ar-SA"/>
               </w:rPr>
@@ -35371,7 +36349,7 @@
                 <w:rFonts w:eastAsia="Times New Roman"/>
                 <w:b/>
                 <w:kern w:val="0"/>
-                <w:sz w:val="18"/>
+                <w:sz w:val="17"/>
                 <w:szCs w:val="22"/>
                 <w:lang w:val="en-US" w:eastAsia="en-US" w:bidi="ar-SA"/>
               </w:rPr>
@@ -35402,7 +36380,7 @@
                 <w:rFonts w:eastAsia="Times New Roman"/>
                 <w:b/>
                 <w:kern w:val="0"/>
-                <w:sz w:val="18"/>
+                <w:sz w:val="17"/>
                 <w:szCs w:val="22"/>
                 <w:lang w:val="en-US" w:eastAsia="en-US" w:bidi="ar-SA"/>
               </w:rPr>
@@ -35436,7 +36414,7 @@
                 <w:rFonts w:eastAsia="Times New Roman"/>
                 <w:b w:val="false"/>
                 <w:kern w:val="0"/>
-                <w:sz w:val="18"/>
+                <w:sz w:val="17"/>
                 <w:szCs w:val="22"/>
                 <w:lang w:val="en-US" w:eastAsia="en-US" w:bidi="ar-SA"/>
               </w:rPr>
@@ -35467,7 +36445,7 @@
                 <w:rFonts w:eastAsia="Times New Roman"/>
                 <w:b w:val="false"/>
                 <w:kern w:val="0"/>
-                <w:sz w:val="18"/>
+                <w:sz w:val="17"/>
                 <w:szCs w:val="22"/>
                 <w:lang w:val="en-US" w:eastAsia="en-US" w:bidi="ar-SA"/>
               </w:rPr>
@@ -35498,7 +36476,38 @@
                 <w:rFonts w:eastAsia="Times New Roman"/>
                 <w:b w:val="false"/>
                 <w:kern w:val="0"/>
-                <w:sz w:val="18"/>
+                <w:sz w:val="17"/>
+                <w:szCs w:val="22"/>
+                <w:lang w:val="en-US" w:eastAsia="en-US" w:bidi="ar-SA"/>
+              </w:rPr>
+              <w:t>☑</w:t>
+            </w:r>
+          </w:p>
+        </w:tc>
+        <w:tc>
+          <w:tcPr>
+            <w:tcW w:w="1802" w:type="dxa"/>
+            <w:tcBorders/>
+            <w:vAlign w:val="center"/>
+          </w:tcPr>
+          <w:p>
+            <w:pPr>
+              <w:pStyle w:val="Normal"/>
+              <w:widowControl/>
+              <w:spacing w:lineRule="auto" w:line="240" w:before="0" w:after="0"/>
+              <w:jc w:val="left"/>
+              <w:rPr>
+                <w:kern w:val="0"/>
+                <w:szCs w:val="22"/>
+                <w:lang w:val="en-US" w:eastAsia="en-US" w:bidi="ar-SA"/>
+              </w:rPr>
+            </w:pPr>
+            <w:r>
+              <w:rPr>
+                <w:rFonts w:eastAsia="Times New Roman"/>
+                <w:b w:val="false"/>
+                <w:kern w:val="0"/>
+                <w:sz w:val="17"/>
                 <w:szCs w:val="22"/>
                 <w:lang w:val="en-US" w:eastAsia="en-US" w:bidi="ar-SA"/>
               </w:rPr>
@@ -35529,38 +36538,7 @@
                 <w:rFonts w:eastAsia="Times New Roman"/>
                 <w:b w:val="false"/>
                 <w:kern w:val="0"/>
-                <w:sz w:val="18"/>
-                <w:szCs w:val="22"/>
-                <w:lang w:val="en-US" w:eastAsia="en-US" w:bidi="ar-SA"/>
-              </w:rPr>
-              <w:t>☐</w:t>
-            </w:r>
-          </w:p>
-        </w:tc>
-        <w:tc>
-          <w:tcPr>
-            <w:tcW w:w="1802" w:type="dxa"/>
-            <w:tcBorders/>
-            <w:vAlign w:val="center"/>
-          </w:tcPr>
-          <w:p>
-            <w:pPr>
-              <w:pStyle w:val="Normal"/>
-              <w:widowControl/>
-              <w:spacing w:lineRule="auto" w:line="240" w:before="0" w:after="0"/>
-              <w:jc w:val="left"/>
-              <w:rPr>
-                <w:kern w:val="0"/>
-                <w:szCs w:val="22"/>
-                <w:lang w:val="en-US" w:eastAsia="en-US" w:bidi="ar-SA"/>
-              </w:rPr>
-            </w:pPr>
-            <w:r>
-              <w:rPr>
-                <w:rFonts w:eastAsia="Times New Roman"/>
-                <w:b w:val="false"/>
-                <w:kern w:val="0"/>
-                <w:sz w:val="18"/>
+                <w:sz w:val="17"/>
                 <w:szCs w:val="22"/>
                 <w:lang w:val="en-US" w:eastAsia="en-US" w:bidi="ar-SA"/>
               </w:rPr>
@@ -35594,7 +36572,7 @@
                 <w:rFonts w:eastAsia="Times New Roman"/>
                 <w:b w:val="false"/>
                 <w:kern w:val="0"/>
-                <w:sz w:val="18"/>
+                <w:sz w:val="17"/>
                 <w:szCs w:val="22"/>
                 <w:lang w:val="en-US" w:eastAsia="en-US" w:bidi="ar-SA"/>
               </w:rPr>
@@ -35625,7 +36603,38 @@
                 <w:rFonts w:eastAsia="Times New Roman"/>
                 <w:b w:val="false"/>
                 <w:kern w:val="0"/>
-                <w:sz w:val="18"/>
+                <w:sz w:val="17"/>
+                <w:szCs w:val="22"/>
+                <w:lang w:val="en-US" w:eastAsia="en-US" w:bidi="ar-SA"/>
+              </w:rPr>
+              <w:t>☑</w:t>
+            </w:r>
+          </w:p>
+        </w:tc>
+        <w:tc>
+          <w:tcPr>
+            <w:tcW w:w="1802" w:type="dxa"/>
+            <w:tcBorders/>
+            <w:vAlign w:val="center"/>
+          </w:tcPr>
+          <w:p>
+            <w:pPr>
+              <w:pStyle w:val="Normal"/>
+              <w:widowControl/>
+              <w:spacing w:lineRule="auto" w:line="240" w:before="0" w:after="0"/>
+              <w:jc w:val="left"/>
+              <w:rPr>
+                <w:kern w:val="0"/>
+                <w:szCs w:val="22"/>
+                <w:lang w:val="en-US" w:eastAsia="en-US" w:bidi="ar-SA"/>
+              </w:rPr>
+            </w:pPr>
+            <w:r>
+              <w:rPr>
+                <w:rFonts w:eastAsia="Times New Roman"/>
+                <w:b w:val="false"/>
+                <w:kern w:val="0"/>
+                <w:sz w:val="17"/>
                 <w:szCs w:val="22"/>
                 <w:lang w:val="en-US" w:eastAsia="en-US" w:bidi="ar-SA"/>
               </w:rPr>
@@ -35656,7 +36665,7 @@
                 <w:rFonts w:eastAsia="Times New Roman"/>
                 <w:b w:val="false"/>
                 <w:kern w:val="0"/>
-                <w:sz w:val="18"/>
+                <w:sz w:val="17"/>
                 <w:szCs w:val="22"/>
                 <w:lang w:val="en-US" w:eastAsia="en-US" w:bidi="ar-SA"/>
               </w:rPr>
@@ -35687,38 +36696,7 @@
                 <w:rFonts w:eastAsia="Times New Roman"/>
                 <w:b w:val="false"/>
                 <w:kern w:val="0"/>
-                <w:sz w:val="18"/>
-                <w:szCs w:val="22"/>
-                <w:lang w:val="en-US" w:eastAsia="en-US" w:bidi="ar-SA"/>
-              </w:rPr>
-              <w:t>☐</w:t>
-            </w:r>
-          </w:p>
-        </w:tc>
-        <w:tc>
-          <w:tcPr>
-            <w:tcW w:w="1802" w:type="dxa"/>
-            <w:tcBorders/>
-            <w:vAlign w:val="center"/>
-          </w:tcPr>
-          <w:p>
-            <w:pPr>
-              <w:pStyle w:val="Normal"/>
-              <w:widowControl/>
-              <w:spacing w:lineRule="auto" w:line="240" w:before="0" w:after="0"/>
-              <w:jc w:val="left"/>
-              <w:rPr>
-                <w:kern w:val="0"/>
-                <w:szCs w:val="22"/>
-                <w:lang w:val="en-US" w:eastAsia="en-US" w:bidi="ar-SA"/>
-              </w:rPr>
-            </w:pPr>
-            <w:r>
-              <w:rPr>
-                <w:rFonts w:eastAsia="Times New Roman"/>
-                <w:b w:val="false"/>
-                <w:kern w:val="0"/>
-                <w:sz w:val="18"/>
+                <w:sz w:val="17"/>
                 <w:szCs w:val="22"/>
                 <w:lang w:val="en-US" w:eastAsia="en-US" w:bidi="ar-SA"/>
               </w:rPr>
@@ -35752,7 +36730,7 @@
                 <w:rFonts w:eastAsia="Times New Roman"/>
                 <w:b w:val="false"/>
                 <w:kern w:val="0"/>
-                <w:sz w:val="18"/>
+                <w:sz w:val="17"/>
                 <w:szCs w:val="22"/>
                 <w:lang w:val="en-US" w:eastAsia="en-US" w:bidi="ar-SA"/>
               </w:rPr>
@@ -35783,7 +36761,38 @@
                 <w:rFonts w:eastAsia="Times New Roman"/>
                 <w:b w:val="false"/>
                 <w:kern w:val="0"/>
-                <w:sz w:val="18"/>
+                <w:sz w:val="17"/>
+                <w:szCs w:val="22"/>
+                <w:lang w:val="en-US" w:eastAsia="en-US" w:bidi="ar-SA"/>
+              </w:rPr>
+              <w:t>☑</w:t>
+            </w:r>
+          </w:p>
+        </w:tc>
+        <w:tc>
+          <w:tcPr>
+            <w:tcW w:w="1802" w:type="dxa"/>
+            <w:tcBorders/>
+            <w:vAlign w:val="center"/>
+          </w:tcPr>
+          <w:p>
+            <w:pPr>
+              <w:pStyle w:val="Normal"/>
+              <w:widowControl/>
+              <w:spacing w:lineRule="auto" w:line="240" w:before="0" w:after="0"/>
+              <w:jc w:val="left"/>
+              <w:rPr>
+                <w:kern w:val="0"/>
+                <w:szCs w:val="22"/>
+                <w:lang w:val="en-US" w:eastAsia="en-US" w:bidi="ar-SA"/>
+              </w:rPr>
+            </w:pPr>
+            <w:r>
+              <w:rPr>
+                <w:rFonts w:eastAsia="Times New Roman"/>
+                <w:b w:val="false"/>
+                <w:kern w:val="0"/>
+                <w:sz w:val="17"/>
                 <w:szCs w:val="22"/>
                 <w:lang w:val="en-US" w:eastAsia="en-US" w:bidi="ar-SA"/>
               </w:rPr>
@@ -35814,7 +36823,7 @@
                 <w:rFonts w:eastAsia="Times New Roman"/>
                 <w:b w:val="false"/>
                 <w:kern w:val="0"/>
-                <w:sz w:val="18"/>
+                <w:sz w:val="17"/>
                 <w:szCs w:val="22"/>
                 <w:lang w:val="en-US" w:eastAsia="en-US" w:bidi="ar-SA"/>
               </w:rPr>
@@ -35845,38 +36854,7 @@
                 <w:rFonts w:eastAsia="Times New Roman"/>
                 <w:b w:val="false"/>
                 <w:kern w:val="0"/>
-                <w:sz w:val="18"/>
-                <w:szCs w:val="22"/>
-                <w:lang w:val="en-US" w:eastAsia="en-US" w:bidi="ar-SA"/>
-              </w:rPr>
-              <w:t>☐</w:t>
-            </w:r>
-          </w:p>
-        </w:tc>
-        <w:tc>
-          <w:tcPr>
-            <w:tcW w:w="1802" w:type="dxa"/>
-            <w:tcBorders/>
-            <w:vAlign w:val="center"/>
-          </w:tcPr>
-          <w:p>
-            <w:pPr>
-              <w:pStyle w:val="Normal"/>
-              <w:widowControl/>
-              <w:spacing w:lineRule="auto" w:line="240" w:before="0" w:after="0"/>
-              <w:jc w:val="left"/>
-              <w:rPr>
-                <w:kern w:val="0"/>
-                <w:szCs w:val="22"/>
-                <w:lang w:val="en-US" w:eastAsia="en-US" w:bidi="ar-SA"/>
-              </w:rPr>
-            </w:pPr>
-            <w:r>
-              <w:rPr>
-                <w:rFonts w:eastAsia="Times New Roman"/>
-                <w:b w:val="false"/>
-                <w:kern w:val="0"/>
-                <w:sz w:val="18"/>
+                <w:sz w:val="17"/>
                 <w:szCs w:val="22"/>
                 <w:lang w:val="en-US" w:eastAsia="en-US" w:bidi="ar-SA"/>
               </w:rPr>
@@ -35910,7 +36888,7 @@
                 <w:rFonts w:eastAsia="Times New Roman"/>
                 <w:b w:val="false"/>
                 <w:kern w:val="0"/>
-                <w:sz w:val="18"/>
+                <w:sz w:val="17"/>
                 <w:szCs w:val="22"/>
                 <w:lang w:val="en-US" w:eastAsia="en-US" w:bidi="ar-SA"/>
               </w:rPr>
@@ -35941,7 +36919,7 @@
                 <w:rFonts w:eastAsia="Times New Roman"/>
                 <w:b w:val="false"/>
                 <w:kern w:val="0"/>
-                <w:sz w:val="18"/>
+                <w:sz w:val="17"/>
                 <w:szCs w:val="22"/>
                 <w:lang w:val="en-US" w:eastAsia="en-US" w:bidi="ar-SA"/>
               </w:rPr>
@@ -35972,7 +36950,38 @@
                 <w:rFonts w:eastAsia="Times New Roman"/>
                 <w:b w:val="false"/>
                 <w:kern w:val="0"/>
-                <w:sz w:val="18"/>
+                <w:sz w:val="17"/>
+                <w:szCs w:val="22"/>
+                <w:lang w:val="en-US" w:eastAsia="en-US" w:bidi="ar-SA"/>
+              </w:rPr>
+              <w:t>☑</w:t>
+            </w:r>
+          </w:p>
+        </w:tc>
+        <w:tc>
+          <w:tcPr>
+            <w:tcW w:w="1802" w:type="dxa"/>
+            <w:tcBorders/>
+            <w:vAlign w:val="center"/>
+          </w:tcPr>
+          <w:p>
+            <w:pPr>
+              <w:pStyle w:val="Normal"/>
+              <w:widowControl/>
+              <w:spacing w:lineRule="auto" w:line="240" w:before="0" w:after="0"/>
+              <w:jc w:val="left"/>
+              <w:rPr>
+                <w:kern w:val="0"/>
+                <w:szCs w:val="22"/>
+                <w:lang w:val="en-US" w:eastAsia="en-US" w:bidi="ar-SA"/>
+              </w:rPr>
+            </w:pPr>
+            <w:r>
+              <w:rPr>
+                <w:rFonts w:eastAsia="Times New Roman"/>
+                <w:b w:val="false"/>
+                <w:kern w:val="0"/>
+                <w:sz w:val="17"/>
                 <w:szCs w:val="22"/>
                 <w:lang w:val="en-US" w:eastAsia="en-US" w:bidi="ar-SA"/>
               </w:rPr>
@@ -36003,38 +37012,7 @@
                 <w:rFonts w:eastAsia="Times New Roman"/>
                 <w:b w:val="false"/>
                 <w:kern w:val="0"/>
-                <w:sz w:val="18"/>
-                <w:szCs w:val="22"/>
-                <w:lang w:val="en-US" w:eastAsia="en-US" w:bidi="ar-SA"/>
-              </w:rPr>
-              <w:t>☐</w:t>
-            </w:r>
-          </w:p>
-        </w:tc>
-        <w:tc>
-          <w:tcPr>
-            <w:tcW w:w="1802" w:type="dxa"/>
-            <w:tcBorders/>
-            <w:vAlign w:val="center"/>
-          </w:tcPr>
-          <w:p>
-            <w:pPr>
-              <w:pStyle w:val="Normal"/>
-              <w:widowControl/>
-              <w:spacing w:lineRule="auto" w:line="240" w:before="0" w:after="0"/>
-              <w:jc w:val="left"/>
-              <w:rPr>
-                <w:kern w:val="0"/>
-                <w:szCs w:val="22"/>
-                <w:lang w:val="en-US" w:eastAsia="en-US" w:bidi="ar-SA"/>
-              </w:rPr>
-            </w:pPr>
-            <w:r>
-              <w:rPr>
-                <w:rFonts w:eastAsia="Times New Roman"/>
-                <w:b w:val="false"/>
-                <w:kern w:val="0"/>
-                <w:sz w:val="18"/>
+                <w:sz w:val="17"/>
                 <w:szCs w:val="22"/>
                 <w:lang w:val="en-US" w:eastAsia="en-US" w:bidi="ar-SA"/>
               </w:rPr>
@@ -36068,7 +37046,7 @@
                 <w:rFonts w:eastAsia="Times New Roman"/>
                 <w:b w:val="false"/>
                 <w:kern w:val="0"/>
-                <w:sz w:val="18"/>
+                <w:sz w:val="17"/>
                 <w:szCs w:val="22"/>
                 <w:lang w:val="en-US" w:eastAsia="en-US" w:bidi="ar-SA"/>
               </w:rPr>
@@ -36099,7 +37077,7 @@
                 <w:rFonts w:eastAsia="Times New Roman"/>
                 <w:b w:val="false"/>
                 <w:kern w:val="0"/>
-                <w:sz w:val="18"/>
+                <w:sz w:val="17"/>
                 <w:szCs w:val="22"/>
                 <w:lang w:val="en-US" w:eastAsia="en-US" w:bidi="ar-SA"/>
               </w:rPr>
@@ -36130,7 +37108,38 @@
                 <w:rFonts w:eastAsia="Times New Roman"/>
                 <w:b w:val="false"/>
                 <w:kern w:val="0"/>
-                <w:sz w:val="18"/>
+                <w:sz w:val="17"/>
+                <w:szCs w:val="22"/>
+                <w:lang w:val="en-US" w:eastAsia="en-US" w:bidi="ar-SA"/>
+              </w:rPr>
+              <w:t>☑</w:t>
+            </w:r>
+          </w:p>
+        </w:tc>
+        <w:tc>
+          <w:tcPr>
+            <w:tcW w:w="1802" w:type="dxa"/>
+            <w:tcBorders/>
+            <w:vAlign w:val="center"/>
+          </w:tcPr>
+          <w:p>
+            <w:pPr>
+              <w:pStyle w:val="Normal"/>
+              <w:widowControl/>
+              <w:spacing w:lineRule="auto" w:line="240" w:before="0" w:after="0"/>
+              <w:jc w:val="left"/>
+              <w:rPr>
+                <w:kern w:val="0"/>
+                <w:szCs w:val="22"/>
+                <w:lang w:val="en-US" w:eastAsia="en-US" w:bidi="ar-SA"/>
+              </w:rPr>
+            </w:pPr>
+            <w:r>
+              <w:rPr>
+                <w:rFonts w:eastAsia="Times New Roman"/>
+                <w:b w:val="false"/>
+                <w:kern w:val="0"/>
+                <w:sz w:val="17"/>
                 <w:szCs w:val="22"/>
                 <w:lang w:val="en-US" w:eastAsia="en-US" w:bidi="ar-SA"/>
               </w:rPr>
@@ -36161,38 +37170,7 @@
                 <w:rFonts w:eastAsia="Times New Roman"/>
                 <w:b w:val="false"/>
                 <w:kern w:val="0"/>
-                <w:sz w:val="18"/>
-                <w:szCs w:val="22"/>
-                <w:lang w:val="en-US" w:eastAsia="en-US" w:bidi="ar-SA"/>
-              </w:rPr>
-              <w:t>☐</w:t>
-            </w:r>
-          </w:p>
-        </w:tc>
-        <w:tc>
-          <w:tcPr>
-            <w:tcW w:w="1802" w:type="dxa"/>
-            <w:tcBorders/>
-            <w:vAlign w:val="center"/>
-          </w:tcPr>
-          <w:p>
-            <w:pPr>
-              <w:pStyle w:val="Normal"/>
-              <w:widowControl/>
-              <w:spacing w:lineRule="auto" w:line="240" w:before="0" w:after="0"/>
-              <w:jc w:val="left"/>
-              <w:rPr>
-                <w:kern w:val="0"/>
-                <w:szCs w:val="22"/>
-                <w:lang w:val="en-US" w:eastAsia="en-US" w:bidi="ar-SA"/>
-              </w:rPr>
-            </w:pPr>
-            <w:r>
-              <w:rPr>
-                <w:rFonts w:eastAsia="Times New Roman"/>
-                <w:b w:val="false"/>
-                <w:kern w:val="0"/>
-                <w:sz w:val="18"/>
+                <w:sz w:val="17"/>
                 <w:szCs w:val="22"/>
                 <w:lang w:val="en-US" w:eastAsia="en-US" w:bidi="ar-SA"/>
               </w:rPr>
@@ -36263,7 +37241,7 @@
                 <w:rFonts w:eastAsia="Times New Roman"/>
                 <w:b/>
                 <w:kern w:val="0"/>
-                <w:sz w:val="18"/>
+                <w:sz w:val="17"/>
                 <w:szCs w:val="22"/>
                 <w:lang w:val="en-US" w:eastAsia="en-US" w:bidi="ar-SA"/>
               </w:rPr>
@@ -36294,7 +37272,7 @@
                 <w:rFonts w:eastAsia="Times New Roman"/>
                 <w:b/>
                 <w:kern w:val="0"/>
-                <w:sz w:val="18"/>
+                <w:sz w:val="17"/>
                 <w:szCs w:val="22"/>
                 <w:lang w:val="en-US" w:eastAsia="en-US" w:bidi="ar-SA"/>
               </w:rPr>
@@ -36328,7 +37306,7 @@
                 <w:rFonts w:eastAsia="Times New Roman"/>
                 <w:b w:val="false"/>
                 <w:kern w:val="0"/>
-                <w:sz w:val="18"/>
+                <w:sz w:val="17"/>
                 <w:szCs w:val="22"/>
                 <w:lang w:val="en-US" w:eastAsia="en-US" w:bidi="ar-SA"/>
               </w:rPr>
@@ -36356,10 +37334,14 @@
             </w:pPr>
             <w:r>
               <w:rPr>
-                <w:kern w:val="0"/>
-                <w:szCs w:val="22"/>
-                <w:lang w:val="en-US" w:eastAsia="en-US" w:bidi="ar-SA"/>
-              </w:rPr>
+                <w:rFonts w:eastAsia="Times New Roman"/>
+                <w:b w:val="false"/>
+                <w:kern w:val="0"/>
+                <w:sz w:val="17"/>
+                <w:szCs w:val="22"/>
+                <w:lang w:val="en-US" w:eastAsia="en-US" w:bidi="ar-SA"/>
+              </w:rPr>
+              <w:t>React / Next.js, TypeScript, Chart.js, Plotly.js, FastAPI, SQL Server, Git</w:t>
             </w:r>
           </w:p>
         </w:tc>
@@ -36389,7 +37371,7 @@
                 <w:rFonts w:eastAsia="Times New Roman"/>
                 <w:b w:val="false"/>
                 <w:kern w:val="0"/>
-                <w:sz w:val="18"/>
+                <w:sz w:val="17"/>
                 <w:szCs w:val="22"/>
                 <w:lang w:val="en-US" w:eastAsia="en-US" w:bidi="ar-SA"/>
               </w:rPr>
@@ -36420,7 +37402,7 @@
                 <w:rFonts w:eastAsia="Times New Roman"/>
                 <w:b w:val="false"/>
                 <w:kern w:val="0"/>
-                <w:sz w:val="18"/>
+                <w:sz w:val="17"/>
                 <w:szCs w:val="22"/>
                 <w:lang w:val="en-US" w:eastAsia="en-US" w:bidi="ar-SA"/>
               </w:rPr>
@@ -36431,11 +37413,11 @@
                 <w:rFonts w:eastAsia="Times New Roman"/>
                 <w:b w:val="false"/>
                 <w:kern w:val="0"/>
-                <w:sz w:val="18"/>
-                <w:szCs w:val="22"/>
-                <w:lang w:val="en-US" w:eastAsia="en-US" w:bidi="ar-SA"/>
-              </w:rPr>
-              <w:t>Outstanding    ☐ Good    ☐ Average    ☐ Poor</w:t>
+                <w:sz w:val="17"/>
+                <w:szCs w:val="22"/>
+                <w:lang w:val="en-US" w:eastAsia="en-US" w:bidi="ar-SA"/>
+              </w:rPr>
+              <w:t>Outstanding    ☑ Good    ☐ Average    ☐ Poor</w:t>
             </w:r>
           </w:p>
         </w:tc>
@@ -36465,7 +37447,7 @@
                 <w:rFonts w:eastAsia="Times New Roman"/>
                 <w:b w:val="false"/>
                 <w:kern w:val="0"/>
-                <w:sz w:val="18"/>
+                <w:sz w:val="17"/>
                 <w:szCs w:val="22"/>
                 <w:lang w:val="en-US" w:eastAsia="en-US" w:bidi="ar-SA"/>
               </w:rPr>
@@ -36496,18 +37478,18 @@
                 <w:rFonts w:eastAsia="Times New Roman"/>
                 <w:b w:val="false"/>
                 <w:kern w:val="0"/>
-                <w:sz w:val="18"/>
-                <w:szCs w:val="22"/>
-                <w:lang w:val="en-US" w:eastAsia="en-US" w:bidi="ar-SA"/>
-              </w:rPr>
-              <w:t xml:space="preserve">☐ </w:t>
-            </w:r>
-            <w:r>
-              <w:rPr>
-                <w:rFonts w:eastAsia="Times New Roman"/>
-                <w:b w:val="false"/>
-                <w:kern w:val="0"/>
-                <w:sz w:val="18"/>
+                <w:sz w:val="17"/>
+                <w:szCs w:val="22"/>
+                <w:lang w:val="en-US" w:eastAsia="en-US" w:bidi="ar-SA"/>
+              </w:rPr>
+              <w:t xml:space="preserve">☑ </w:t>
+            </w:r>
+            <w:r>
+              <w:rPr>
+                <w:rFonts w:eastAsia="Times New Roman"/>
+                <w:b w:val="false"/>
+                <w:kern w:val="0"/>
+                <w:sz w:val="17"/>
                 <w:szCs w:val="22"/>
                 <w:lang w:val="en-US" w:eastAsia="en-US" w:bidi="ar-SA"/>
               </w:rPr>
@@ -36541,7 +37523,7 @@
                 <w:rFonts w:eastAsia="Times New Roman"/>
                 <w:b w:val="false"/>
                 <w:kern w:val="0"/>
-                <w:sz w:val="18"/>
+                <w:sz w:val="17"/>
                 <w:szCs w:val="22"/>
                 <w:lang w:val="en-US" w:eastAsia="en-US" w:bidi="ar-SA"/>
               </w:rPr>
@@ -36569,10 +37551,14 @@
             </w:pPr>
             <w:r>
               <w:rPr>
-                <w:kern w:val="0"/>
-                <w:szCs w:val="22"/>
-                <w:lang w:val="en-US" w:eastAsia="en-US" w:bidi="ar-SA"/>
-              </w:rPr>
+                <w:rFonts w:eastAsia="Times New Roman"/>
+                <w:b w:val="false"/>
+                <w:kern w:val="0"/>
+                <w:sz w:val="17"/>
+                <w:szCs w:val="22"/>
+                <w:lang w:val="en-US" w:eastAsia="en-US" w:bidi="ar-SA"/>
+              </w:rPr>
+              <w:t>Learns new tools quickly; careful attention to UI detail and data correctness; responds well to review feedback; took ownership of chart and raw-data features.</w:t>
             </w:r>
           </w:p>
         </w:tc>
@@ -36602,7 +37588,7 @@
                 <w:rFonts w:eastAsia="Times New Roman"/>
                 <w:b w:val="false"/>
                 <w:kern w:val="0"/>
-                <w:sz w:val="18"/>
+                <w:sz w:val="17"/>
                 <w:szCs w:val="22"/>
                 <w:lang w:val="en-US" w:eastAsia="en-US" w:bidi="ar-SA"/>
               </w:rPr>
@@ -36630,10 +37616,14 @@
             </w:pPr>
             <w:r>
               <w:rPr>
-                <w:kern w:val="0"/>
-                <w:szCs w:val="22"/>
-                <w:lang w:val="en-US" w:eastAsia="en-US" w:bidi="ar-SA"/>
-              </w:rPr>
+                <w:rFonts w:eastAsia="Times New Roman"/>
+                <w:b w:val="false"/>
+                <w:kern w:val="0"/>
+                <w:sz w:val="17"/>
+                <w:szCs w:val="22"/>
+                <w:lang w:val="en-US" w:eastAsia="en-US" w:bidi="ar-SA"/>
+              </w:rPr>
+              <w:t>Break large changes into smaller pull requests from the start and write automated tests alongside new features.</w:t>
             </w:r>
           </w:p>
         </w:tc>
@@ -36651,9 +37641,9 @@
         <w:rPr>
           <w:rFonts w:eastAsia="Times New Roman"/>
           <w:b/>
-          <w:sz w:val="19"/>
-        </w:rPr>
-        <w:t>Signature of Industry Mentor / Research Supervisor: __________________________     Date: __________________</w:t>
+          <w:sz w:val="18"/>
+        </w:rPr>
+        <w:t>Signature of Industry Mentor: ______________________   Name: Mr. Manav Gupta   Date: 31 August 2026</w:t>
       </w:r>
     </w:p>
     <w:p>
@@ -38433,11 +39423,58 @@
       </w:pPr>
       <w:r>
         <w:rPr>
-          <w:rFonts w:eastAsia="Times New Roman"/>
           <w:b/>
           <w:sz w:val="21"/>
         </w:rPr>
-        <w:t>Student's Signature: ______________________________     Date: 12 October 2026</w:t>
+        <w:t xml:space="preserve">Student's Signature: </w:t>
+      </w:r>
+      <w:r>
+        <w:rPr/>
+        <w:drawing>
+          <wp:inline distT="0" distB="0" distL="0" distR="0">
+            <wp:extent cx="2192655" cy="269875"/>
+            <wp:effectExtent l="0" t="0" r="0" b="0"/>
+            <wp:docPr id="34" name="Image20"/>
+            <wp:cNvGraphicFramePr>
+              <a:graphicFrameLocks xmlns:a="http://schemas.openxmlformats.org/drawingml/2006/main" noChangeAspect="1"/>
+            </wp:cNvGraphicFramePr>
+            <a:graphic xmlns:a="http://schemas.openxmlformats.org/drawingml/2006/main">
+              <a:graphicData uri="http://schemas.openxmlformats.org/drawingml/2006/picture">
+                <pic:pic xmlns:pic="http://schemas.openxmlformats.org/drawingml/2006/picture">
+                  <pic:nvPicPr>
+                    <pic:cNvPr id="34" name="Image20"/>
+                    <pic:cNvPicPr>
+                      <a:picLocks noChangeAspect="1" noChangeArrowheads="1"/>
+                    </pic:cNvPicPr>
+                  </pic:nvPicPr>
+                  <pic:blipFill>
+                    <a:blip r:embed="rId38"/>
+                    <a:stretch>
+                      <a:fillRect/>
+                    </a:stretch>
+                  </pic:blipFill>
+                  <pic:spPr bwMode="auto">
+                    <a:xfrm>
+                      <a:off x="0" y="0"/>
+                      <a:ext cx="2192655" cy="269875"/>
+                    </a:xfrm>
+                    <a:prstGeom prst="rect">
+                      <a:avLst/>
+                    </a:prstGeom>
+                    <a:noFill/>
+                  </pic:spPr>
+                </pic:pic>
+              </a:graphicData>
+            </a:graphic>
+          </wp:inline>
+        </w:drawing>
+      </w:r>
+      <w:r>
+        <w:rPr>
+          <w:b/>
+          <w:sz w:val="21"/>
+        </w:rPr>
+        <w:t xml:space="preserve">     Date: 12 October 2026</w:t>
       </w:r>
     </w:p>
     <w:p>
@@ -39193,11 +40230,58 @@
       </w:pPr>
       <w:r>
         <w:rPr>
-          <w:rFonts w:eastAsia="Times New Roman"/>
           <w:b w:val="false"/>
           <w:sz w:val="23"/>
         </w:rPr>
-        <w:t>Signature: ____________________________          Date: 12 October 2026</w:t>
+        <w:t xml:space="preserve">Signature: </w:t>
+      </w:r>
+      <w:r>
+        <w:rPr/>
+        <w:drawing>
+          <wp:inline distT="0" distB="0" distL="0" distR="0">
+            <wp:extent cx="2192655" cy="269875"/>
+            <wp:effectExtent l="0" t="0" r="0" b="0"/>
+            <wp:docPr id="35" name="Image21"/>
+            <wp:cNvGraphicFramePr>
+              <a:graphicFrameLocks xmlns:a="http://schemas.openxmlformats.org/drawingml/2006/main" noChangeAspect="1"/>
+            </wp:cNvGraphicFramePr>
+            <a:graphic xmlns:a="http://schemas.openxmlformats.org/drawingml/2006/main">
+              <a:graphicData uri="http://schemas.openxmlformats.org/drawingml/2006/picture">
+                <pic:pic xmlns:pic="http://schemas.openxmlformats.org/drawingml/2006/picture">
+                  <pic:nvPicPr>
+                    <pic:cNvPr id="35" name="Image21"/>
+                    <pic:cNvPicPr>
+                      <a:picLocks noChangeAspect="1" noChangeArrowheads="1"/>
+                    </pic:cNvPicPr>
+                  </pic:nvPicPr>
+                  <pic:blipFill>
+                    <a:blip r:embed="rId39"/>
+                    <a:stretch>
+                      <a:fillRect/>
+                    </a:stretch>
+                  </pic:blipFill>
+                  <pic:spPr bwMode="auto">
+                    <a:xfrm>
+                      <a:off x="0" y="0"/>
+                      <a:ext cx="2192655" cy="269875"/>
+                    </a:xfrm>
+                    <a:prstGeom prst="rect">
+                      <a:avLst/>
+                    </a:prstGeom>
+                    <a:noFill/>
+                  </pic:spPr>
+                </pic:pic>
+              </a:graphicData>
+            </a:graphic>
+          </wp:inline>
+        </w:drawing>
+      </w:r>
+      <w:r>
+        <w:rPr>
+          <w:b w:val="false"/>
+          <w:sz w:val="23"/>
+        </w:rPr>
+        <w:t xml:space="preserve">          Date: 12 October 2026</w:t>
       </w:r>
     </w:p>
     <w:p>
@@ -39899,10 +40983,14 @@
             </w:pPr>
             <w:r>
               <w:rPr>
-                <w:kern w:val="0"/>
-                <w:szCs w:val="22"/>
-                <w:lang w:val="en-US" w:eastAsia="en-US" w:bidi="ar-SA"/>
-              </w:rPr>
+                <w:rFonts w:eastAsia="Times New Roman"/>
+                <w:b w:val="false"/>
+                <w:kern w:val="0"/>
+                <w:sz w:val="17"/>
+                <w:szCs w:val="22"/>
+                <w:lang w:val="en-US" w:eastAsia="en-US" w:bidi="ar-SA"/>
+              </w:rPr>
+              <w:t>Sunil Maggu</w:t>
             </w:r>
           </w:p>
         </w:tc>
@@ -43409,11 +44497,58 @@
       </w:pPr>
       <w:r>
         <w:rPr>
-          <w:rFonts w:eastAsia="Times New Roman"/>
           <w:b/>
           <w:sz w:val="17"/>
         </w:rPr>
-        <w:t>Student Signature: ______________________   Date: 12 October 2026     Signature of Faculty Counsellor: __________________   Date: _______________</w:t>
+        <w:t xml:space="preserve">Student Signature: </w:t>
+      </w:r>
+      <w:r>
+        <w:rPr/>
+        <w:drawing>
+          <wp:inline distT="0" distB="0" distL="0" distR="0">
+            <wp:extent cx="2192655" cy="269875"/>
+            <wp:effectExtent l="0" t="0" r="0" b="0"/>
+            <wp:docPr id="36" name="Image22"/>
+            <wp:cNvGraphicFramePr>
+              <a:graphicFrameLocks xmlns:a="http://schemas.openxmlformats.org/drawingml/2006/main" noChangeAspect="1"/>
+            </wp:cNvGraphicFramePr>
+            <a:graphic xmlns:a="http://schemas.openxmlformats.org/drawingml/2006/main">
+              <a:graphicData uri="http://schemas.openxmlformats.org/drawingml/2006/picture">
+                <pic:pic xmlns:pic="http://schemas.openxmlformats.org/drawingml/2006/picture">
+                  <pic:nvPicPr>
+                    <pic:cNvPr id="36" name="Image22"/>
+                    <pic:cNvPicPr>
+                      <a:picLocks noChangeAspect="1" noChangeArrowheads="1"/>
+                    </pic:cNvPicPr>
+                  </pic:nvPicPr>
+                  <pic:blipFill>
+                    <a:blip r:embed="rId40"/>
+                    <a:stretch>
+                      <a:fillRect/>
+                    </a:stretch>
+                  </pic:blipFill>
+                  <pic:spPr bwMode="auto">
+                    <a:xfrm>
+                      <a:off x="0" y="0"/>
+                      <a:ext cx="2192655" cy="269875"/>
+                    </a:xfrm>
+                    <a:prstGeom prst="rect">
+                      <a:avLst/>
+                    </a:prstGeom>
+                    <a:noFill/>
+                  </pic:spPr>
+                </pic:pic>
+              </a:graphicData>
+            </a:graphic>
+          </wp:inline>
+        </w:drawing>
+      </w:r>
+      <w:r>
+        <w:rPr>
+          <w:b/>
+          <w:sz w:val="17"/>
+        </w:rPr>
+        <w:t xml:space="preserve">   Date: 12 October 2026     Signature of Faculty Counsellor: __________________   Date: _______________</w:t>
       </w:r>
     </w:p>
     <w:p>
@@ -44180,10 +45315,14 @@
             </w:pPr>
             <w:r>
               <w:rPr>
-                <w:kern w:val="0"/>
-                <w:szCs w:val="22"/>
-                <w:lang w:val="en-US" w:eastAsia="en-US" w:bidi="ar-SA"/>
-              </w:rPr>
+                <w:rFonts w:eastAsia="Times New Roman"/>
+                <w:b w:val="false"/>
+                <w:kern w:val="0"/>
+                <w:sz w:val="16"/>
+                <w:szCs w:val="22"/>
+                <w:lang w:val="en-US" w:eastAsia="en-US" w:bidi="ar-SA"/>
+              </w:rPr>
+              <w:t>Sunil Maggu</w:t>
             </w:r>
           </w:p>
         </w:tc>
@@ -45907,17 +47046,64 @@
       </w:pPr>
       <w:r>
         <w:rPr>
-          <w:rFonts w:eastAsia="Times New Roman"/>
           <w:b/>
           <w:sz w:val="15"/>
         </w:rPr>
-        <w:t>Student Signature: ______________________   Date: 12 October 2026     Faculty Counsellor Signature: _____________________   Date: ___________</w:t>
+        <w:t xml:space="preserve">Student Signature: </w:t>
+      </w:r>
+      <w:r>
+        <w:rPr/>
+        <w:drawing>
+          <wp:inline distT="0" distB="0" distL="0" distR="0">
+            <wp:extent cx="2192655" cy="269875"/>
+            <wp:effectExtent l="0" t="0" r="0" b="0"/>
+            <wp:docPr id="37" name="Image23"/>
+            <wp:cNvGraphicFramePr>
+              <a:graphicFrameLocks xmlns:a="http://schemas.openxmlformats.org/drawingml/2006/main" noChangeAspect="1"/>
+            </wp:cNvGraphicFramePr>
+            <a:graphic xmlns:a="http://schemas.openxmlformats.org/drawingml/2006/main">
+              <a:graphicData uri="http://schemas.openxmlformats.org/drawingml/2006/picture">
+                <pic:pic xmlns:pic="http://schemas.openxmlformats.org/drawingml/2006/picture">
+                  <pic:nvPicPr>
+                    <pic:cNvPr id="37" name="Image23"/>
+                    <pic:cNvPicPr>
+                      <a:picLocks noChangeAspect="1" noChangeArrowheads="1"/>
+                    </pic:cNvPicPr>
+                  </pic:nvPicPr>
+                  <pic:blipFill>
+                    <a:blip r:embed="rId41"/>
+                    <a:stretch>
+                      <a:fillRect/>
+                    </a:stretch>
+                  </pic:blipFill>
+                  <pic:spPr bwMode="auto">
+                    <a:xfrm>
+                      <a:off x="0" y="0"/>
+                      <a:ext cx="2192655" cy="269875"/>
+                    </a:xfrm>
+                    <a:prstGeom prst="rect">
+                      <a:avLst/>
+                    </a:prstGeom>
+                    <a:noFill/>
+                  </pic:spPr>
+                </pic:pic>
+              </a:graphicData>
+            </a:graphic>
+          </wp:inline>
+        </w:drawing>
+      </w:r>
+      <w:r>
+        <w:rPr>
+          <w:b/>
+          <w:sz w:val="15"/>
+        </w:rPr>
+        <w:t xml:space="preserve">   Date: 12 October 2026     Faculty Counsellor Signature: _____________________   Date: ___________</w:t>
       </w:r>
     </w:p>
     <w:sectPr>
-      <w:footerReference w:type="even" r:id="rId18"/>
-      <w:footerReference w:type="default" r:id="rId19"/>
-      <w:footerReference w:type="first" r:id="rId20"/>
+      <w:footerReference w:type="even" r:id="rId42"/>
+      <w:footerReference w:type="default" r:id="rId43"/>
+      <w:footerReference w:type="first" r:id="rId44"/>
       <w:type w:val="nextPage"/>
       <w:pgSz w:w="11906" w:h="16838"/>
       <w:pgMar w:left="1417" w:right="1417" w:gutter="0" w:header="0" w:top="1417" w:footer="737" w:bottom="1417"/>

</xml_diff>

<commit_message>
Add mentor's typed e-signature (approved by mentor)
Co-Authored-By: Claude Opus 5.5 <noreply@anthropic.com>
</commit_message>
<xml_diff>
--- a/Report2_Supporting_Documents_Ishan_08514803123.docx
+++ b/Report2_Supporting_Documents_Ishan_08514803123.docx
@@ -11599,11 +11599,35 @@
       </w:pPr>
       <w:r>
         <w:rPr>
-          <w:rFonts w:eastAsia="Times New Roman"/>
-          <w:b w:val="false"/>
-          <w:sz w:val="18"/>
-        </w:rPr>
-        <w:t>Signature: ______________________   Name: Mr. Manav Gupta   Date: 08 May 2026</w:t>
+          <w:b w:val="false"/>
+          <w:i w:val="false"/>
+          <w:sz w:val="18"/>
+        </w:rPr>
+        <w:t xml:space="preserve">Signature: </w:t>
+      </w:r>
+      <w:r>
+        <w:rPr>
+          <w:b/>
+          <w:i/>
+          <w:sz w:val="18"/>
+        </w:rPr>
+        <w:t>/s/ Mr. Manav Gupta</w:t>
+      </w:r>
+      <w:r>
+        <w:rPr>
+          <w:b w:val="false"/>
+          <w:i/>
+          <w:sz w:val="18"/>
+        </w:rPr>
+        <w:t xml:space="preserve"> (digitally approved)   </w:t>
+      </w:r>
+      <w:r>
+        <w:rPr>
+          <w:b w:val="false"/>
+          <w:i w:val="false"/>
+          <w:sz w:val="18"/>
+        </w:rPr>
+        <w:t>Name: Mr. Manav Gupta   Date: 08 May 2026</w:t>
       </w:r>
       <w:r>
         <w:br w:type="page"/>
@@ -13103,11 +13127,35 @@
       </w:pPr>
       <w:r>
         <w:rPr>
-          <w:rFonts w:eastAsia="Times New Roman"/>
-          <w:b w:val="false"/>
-          <w:sz w:val="18"/>
-        </w:rPr>
-        <w:t>Signature: ______________________   Name: Mr. Manav Gupta   Date: 15 May 2026</w:t>
+          <w:b w:val="false"/>
+          <w:i w:val="false"/>
+          <w:sz w:val="18"/>
+        </w:rPr>
+        <w:t xml:space="preserve">Signature: </w:t>
+      </w:r>
+      <w:r>
+        <w:rPr>
+          <w:b/>
+          <w:i/>
+          <w:sz w:val="18"/>
+        </w:rPr>
+        <w:t>/s/ Mr. Manav Gupta</w:t>
+      </w:r>
+      <w:r>
+        <w:rPr>
+          <w:b w:val="false"/>
+          <w:i/>
+          <w:sz w:val="18"/>
+        </w:rPr>
+        <w:t xml:space="preserve"> (digitally approved)   </w:t>
+      </w:r>
+      <w:r>
+        <w:rPr>
+          <w:b w:val="false"/>
+          <w:i w:val="false"/>
+          <w:sz w:val="18"/>
+        </w:rPr>
+        <w:t>Name: Mr. Manav Gupta   Date: 15 May 2026</w:t>
       </w:r>
       <w:r>
         <w:br w:type="page"/>
@@ -14607,11 +14655,35 @@
       </w:pPr>
       <w:r>
         <w:rPr>
-          <w:rFonts w:eastAsia="Times New Roman"/>
-          <w:b w:val="false"/>
-          <w:sz w:val="18"/>
-        </w:rPr>
-        <w:t>Signature: ______________________   Name: Mr. Manav Gupta   Date: 22 May 2026</w:t>
+          <w:b w:val="false"/>
+          <w:i w:val="false"/>
+          <w:sz w:val="18"/>
+        </w:rPr>
+        <w:t xml:space="preserve">Signature: </w:t>
+      </w:r>
+      <w:r>
+        <w:rPr>
+          <w:b/>
+          <w:i/>
+          <w:sz w:val="18"/>
+        </w:rPr>
+        <w:t>/s/ Mr. Manav Gupta</w:t>
+      </w:r>
+      <w:r>
+        <w:rPr>
+          <w:b w:val="false"/>
+          <w:i/>
+          <w:sz w:val="18"/>
+        </w:rPr>
+        <w:t xml:space="preserve"> (digitally approved)   </w:t>
+      </w:r>
+      <w:r>
+        <w:rPr>
+          <w:b w:val="false"/>
+          <w:i w:val="false"/>
+          <w:sz w:val="18"/>
+        </w:rPr>
+        <w:t>Name: Mr. Manav Gupta   Date: 22 May 2026</w:t>
       </w:r>
       <w:r>
         <w:br w:type="page"/>
@@ -16111,11 +16183,35 @@
       </w:pPr>
       <w:r>
         <w:rPr>
-          <w:rFonts w:eastAsia="Times New Roman"/>
-          <w:b w:val="false"/>
-          <w:sz w:val="18"/>
-        </w:rPr>
-        <w:t>Signature: ______________________   Name: Mr. Manav Gupta   Date: 29 May 2026</w:t>
+          <w:b w:val="false"/>
+          <w:i w:val="false"/>
+          <w:sz w:val="18"/>
+        </w:rPr>
+        <w:t xml:space="preserve">Signature: </w:t>
+      </w:r>
+      <w:r>
+        <w:rPr>
+          <w:b/>
+          <w:i/>
+          <w:sz w:val="18"/>
+        </w:rPr>
+        <w:t>/s/ Mr. Manav Gupta</w:t>
+      </w:r>
+      <w:r>
+        <w:rPr>
+          <w:b w:val="false"/>
+          <w:i/>
+          <w:sz w:val="18"/>
+        </w:rPr>
+        <w:t xml:space="preserve"> (digitally approved)   </w:t>
+      </w:r>
+      <w:r>
+        <w:rPr>
+          <w:b w:val="false"/>
+          <w:i w:val="false"/>
+          <w:sz w:val="18"/>
+        </w:rPr>
+        <w:t>Name: Mr. Manav Gupta   Date: 29 May 2026</w:t>
       </w:r>
       <w:r>
         <w:br w:type="page"/>
@@ -17615,11 +17711,35 @@
       </w:pPr>
       <w:r>
         <w:rPr>
-          <w:rFonts w:eastAsia="Times New Roman"/>
-          <w:b w:val="false"/>
-          <w:sz w:val="18"/>
-        </w:rPr>
-        <w:t>Signature: ______________________   Name: Mr. Manav Gupta   Date: 05 June 2026</w:t>
+          <w:b w:val="false"/>
+          <w:i w:val="false"/>
+          <w:sz w:val="18"/>
+        </w:rPr>
+        <w:t xml:space="preserve">Signature: </w:t>
+      </w:r>
+      <w:r>
+        <w:rPr>
+          <w:b/>
+          <w:i/>
+          <w:sz w:val="18"/>
+        </w:rPr>
+        <w:t>/s/ Mr. Manav Gupta</w:t>
+      </w:r>
+      <w:r>
+        <w:rPr>
+          <w:b w:val="false"/>
+          <w:i/>
+          <w:sz w:val="18"/>
+        </w:rPr>
+        <w:t xml:space="preserve"> (digitally approved)   </w:t>
+      </w:r>
+      <w:r>
+        <w:rPr>
+          <w:b w:val="false"/>
+          <w:i w:val="false"/>
+          <w:sz w:val="18"/>
+        </w:rPr>
+        <w:t>Name: Mr. Manav Gupta   Date: 05 June 2026</w:t>
       </w:r>
       <w:r>
         <w:br w:type="page"/>
@@ -19119,11 +19239,35 @@
       </w:pPr>
       <w:r>
         <w:rPr>
-          <w:rFonts w:eastAsia="Times New Roman"/>
-          <w:b w:val="false"/>
-          <w:sz w:val="18"/>
-        </w:rPr>
-        <w:t>Signature: ______________________   Name: Mr. Manav Gupta   Date: 12 June 2026</w:t>
+          <w:b w:val="false"/>
+          <w:i w:val="false"/>
+          <w:sz w:val="18"/>
+        </w:rPr>
+        <w:t xml:space="preserve">Signature: </w:t>
+      </w:r>
+      <w:r>
+        <w:rPr>
+          <w:b/>
+          <w:i/>
+          <w:sz w:val="18"/>
+        </w:rPr>
+        <w:t>/s/ Mr. Manav Gupta</w:t>
+      </w:r>
+      <w:r>
+        <w:rPr>
+          <w:b w:val="false"/>
+          <w:i/>
+          <w:sz w:val="18"/>
+        </w:rPr>
+        <w:t xml:space="preserve"> (digitally approved)   </w:t>
+      </w:r>
+      <w:r>
+        <w:rPr>
+          <w:b w:val="false"/>
+          <w:i w:val="false"/>
+          <w:sz w:val="18"/>
+        </w:rPr>
+        <w:t>Name: Mr. Manav Gupta   Date: 12 June 2026</w:t>
       </w:r>
       <w:r>
         <w:br w:type="page"/>
@@ -20623,11 +20767,35 @@
       </w:pPr>
       <w:r>
         <w:rPr>
-          <w:rFonts w:eastAsia="Times New Roman"/>
-          <w:b w:val="false"/>
-          <w:sz w:val="18"/>
-        </w:rPr>
-        <w:t>Signature: ______________________   Name: Mr. Manav Gupta   Date: 19 June 2026</w:t>
+          <w:b w:val="false"/>
+          <w:i w:val="false"/>
+          <w:sz w:val="18"/>
+        </w:rPr>
+        <w:t xml:space="preserve">Signature: </w:t>
+      </w:r>
+      <w:r>
+        <w:rPr>
+          <w:b/>
+          <w:i/>
+          <w:sz w:val="18"/>
+        </w:rPr>
+        <w:t>/s/ Mr. Manav Gupta</w:t>
+      </w:r>
+      <w:r>
+        <w:rPr>
+          <w:b w:val="false"/>
+          <w:i/>
+          <w:sz w:val="18"/>
+        </w:rPr>
+        <w:t xml:space="preserve"> (digitally approved)   </w:t>
+      </w:r>
+      <w:r>
+        <w:rPr>
+          <w:b w:val="false"/>
+          <w:i w:val="false"/>
+          <w:sz w:val="18"/>
+        </w:rPr>
+        <w:t>Name: Mr. Manav Gupta   Date: 19 June 2026</w:t>
       </w:r>
       <w:r>
         <w:br w:type="page"/>
@@ -22127,11 +22295,35 @@
       </w:pPr>
       <w:r>
         <w:rPr>
-          <w:rFonts w:eastAsia="Times New Roman"/>
-          <w:b w:val="false"/>
-          <w:sz w:val="18"/>
-        </w:rPr>
-        <w:t>Signature: ______________________   Name: Mr. Manav Gupta   Date: 26 June 2026</w:t>
+          <w:b w:val="false"/>
+          <w:i w:val="false"/>
+          <w:sz w:val="18"/>
+        </w:rPr>
+        <w:t xml:space="preserve">Signature: </w:t>
+      </w:r>
+      <w:r>
+        <w:rPr>
+          <w:b/>
+          <w:i/>
+          <w:sz w:val="18"/>
+        </w:rPr>
+        <w:t>/s/ Mr. Manav Gupta</w:t>
+      </w:r>
+      <w:r>
+        <w:rPr>
+          <w:b w:val="false"/>
+          <w:i/>
+          <w:sz w:val="18"/>
+        </w:rPr>
+        <w:t xml:space="preserve"> (digitally approved)   </w:t>
+      </w:r>
+      <w:r>
+        <w:rPr>
+          <w:b w:val="false"/>
+          <w:i w:val="false"/>
+          <w:sz w:val="18"/>
+        </w:rPr>
+        <w:t>Name: Mr. Manav Gupta   Date: 26 June 2026</w:t>
       </w:r>
       <w:r>
         <w:br w:type="page"/>
@@ -23631,11 +23823,35 @@
       </w:pPr>
       <w:r>
         <w:rPr>
-          <w:rFonts w:eastAsia="Times New Roman"/>
-          <w:b w:val="false"/>
-          <w:sz w:val="18"/>
-        </w:rPr>
-        <w:t>Signature: ______________________   Name: Mr. Manav Gupta   Date: 03 July 2026</w:t>
+          <w:b w:val="false"/>
+          <w:i w:val="false"/>
+          <w:sz w:val="18"/>
+        </w:rPr>
+        <w:t xml:space="preserve">Signature: </w:t>
+      </w:r>
+      <w:r>
+        <w:rPr>
+          <w:b/>
+          <w:i/>
+          <w:sz w:val="18"/>
+        </w:rPr>
+        <w:t>/s/ Mr. Manav Gupta</w:t>
+      </w:r>
+      <w:r>
+        <w:rPr>
+          <w:b w:val="false"/>
+          <w:i/>
+          <w:sz w:val="18"/>
+        </w:rPr>
+        <w:t xml:space="preserve"> (digitally approved)   </w:t>
+      </w:r>
+      <w:r>
+        <w:rPr>
+          <w:b w:val="false"/>
+          <w:i w:val="false"/>
+          <w:sz w:val="18"/>
+        </w:rPr>
+        <w:t>Name: Mr. Manav Gupta   Date: 03 July 2026</w:t>
       </w:r>
       <w:r>
         <w:br w:type="page"/>
@@ -25135,11 +25351,35 @@
       </w:pPr>
       <w:r>
         <w:rPr>
-          <w:rFonts w:eastAsia="Times New Roman"/>
-          <w:b w:val="false"/>
-          <w:sz w:val="18"/>
-        </w:rPr>
-        <w:t>Signature: ______________________   Name: Mr. Manav Gupta   Date: 10 July 2026</w:t>
+          <w:b w:val="false"/>
+          <w:i w:val="false"/>
+          <w:sz w:val="18"/>
+        </w:rPr>
+        <w:t xml:space="preserve">Signature: </w:t>
+      </w:r>
+      <w:r>
+        <w:rPr>
+          <w:b/>
+          <w:i/>
+          <w:sz w:val="18"/>
+        </w:rPr>
+        <w:t>/s/ Mr. Manav Gupta</w:t>
+      </w:r>
+      <w:r>
+        <w:rPr>
+          <w:b w:val="false"/>
+          <w:i/>
+          <w:sz w:val="18"/>
+        </w:rPr>
+        <w:t xml:space="preserve"> (digitally approved)   </w:t>
+      </w:r>
+      <w:r>
+        <w:rPr>
+          <w:b w:val="false"/>
+          <w:i w:val="false"/>
+          <w:sz w:val="18"/>
+        </w:rPr>
+        <w:t>Name: Mr. Manav Gupta   Date: 10 July 2026</w:t>
       </w:r>
       <w:r>
         <w:br w:type="page"/>
@@ -26639,11 +26879,35 @@
       </w:pPr>
       <w:r>
         <w:rPr>
-          <w:rFonts w:eastAsia="Times New Roman"/>
-          <w:b w:val="false"/>
-          <w:sz w:val="18"/>
-        </w:rPr>
-        <w:t>Signature: ______________________   Name: Mr. Manav Gupta   Date: 17 July 2026</w:t>
+          <w:b w:val="false"/>
+          <w:i w:val="false"/>
+          <w:sz w:val="18"/>
+        </w:rPr>
+        <w:t xml:space="preserve">Signature: </w:t>
+      </w:r>
+      <w:r>
+        <w:rPr>
+          <w:b/>
+          <w:i/>
+          <w:sz w:val="18"/>
+        </w:rPr>
+        <w:t>/s/ Mr. Manav Gupta</w:t>
+      </w:r>
+      <w:r>
+        <w:rPr>
+          <w:b w:val="false"/>
+          <w:i/>
+          <w:sz w:val="18"/>
+        </w:rPr>
+        <w:t xml:space="preserve"> (digitally approved)   </w:t>
+      </w:r>
+      <w:r>
+        <w:rPr>
+          <w:b w:val="false"/>
+          <w:i w:val="false"/>
+          <w:sz w:val="18"/>
+        </w:rPr>
+        <w:t>Name: Mr. Manav Gupta   Date: 17 July 2026</w:t>
       </w:r>
       <w:r>
         <w:br w:type="page"/>
@@ -28143,11 +28407,35 @@
       </w:pPr>
       <w:r>
         <w:rPr>
-          <w:rFonts w:eastAsia="Times New Roman"/>
-          <w:b w:val="false"/>
-          <w:sz w:val="18"/>
-        </w:rPr>
-        <w:t>Signature: ______________________   Name: Mr. Manav Gupta   Date: 24 July 2026</w:t>
+          <w:b w:val="false"/>
+          <w:i w:val="false"/>
+          <w:sz w:val="18"/>
+        </w:rPr>
+        <w:t xml:space="preserve">Signature: </w:t>
+      </w:r>
+      <w:r>
+        <w:rPr>
+          <w:b/>
+          <w:i/>
+          <w:sz w:val="18"/>
+        </w:rPr>
+        <w:t>/s/ Mr. Manav Gupta</w:t>
+      </w:r>
+      <w:r>
+        <w:rPr>
+          <w:b w:val="false"/>
+          <w:i/>
+          <w:sz w:val="18"/>
+        </w:rPr>
+        <w:t xml:space="preserve"> (digitally approved)   </w:t>
+      </w:r>
+      <w:r>
+        <w:rPr>
+          <w:b w:val="false"/>
+          <w:i w:val="false"/>
+          <w:sz w:val="18"/>
+        </w:rPr>
+        <w:t>Name: Mr. Manav Gupta   Date: 24 July 2026</w:t>
       </w:r>
       <w:r>
         <w:br w:type="page"/>
@@ -29647,11 +29935,35 @@
       </w:pPr>
       <w:r>
         <w:rPr>
-          <w:rFonts w:eastAsia="Times New Roman"/>
-          <w:b w:val="false"/>
-          <w:sz w:val="18"/>
-        </w:rPr>
-        <w:t>Signature: ______________________   Name: Mr. Manav Gupta   Date: 31 July 2026</w:t>
+          <w:b w:val="false"/>
+          <w:i w:val="false"/>
+          <w:sz w:val="18"/>
+        </w:rPr>
+        <w:t xml:space="preserve">Signature: </w:t>
+      </w:r>
+      <w:r>
+        <w:rPr>
+          <w:b/>
+          <w:i/>
+          <w:sz w:val="18"/>
+        </w:rPr>
+        <w:t>/s/ Mr. Manav Gupta</w:t>
+      </w:r>
+      <w:r>
+        <w:rPr>
+          <w:b w:val="false"/>
+          <w:i/>
+          <w:sz w:val="18"/>
+        </w:rPr>
+        <w:t xml:space="preserve"> (digitally approved)   </w:t>
+      </w:r>
+      <w:r>
+        <w:rPr>
+          <w:b w:val="false"/>
+          <w:i w:val="false"/>
+          <w:sz w:val="18"/>
+        </w:rPr>
+        <w:t>Name: Mr. Manav Gupta   Date: 31 July 2026</w:t>
       </w:r>
       <w:r>
         <w:br w:type="page"/>
@@ -31151,11 +31463,35 @@
       </w:pPr>
       <w:r>
         <w:rPr>
-          <w:rFonts w:eastAsia="Times New Roman"/>
-          <w:b w:val="false"/>
-          <w:sz w:val="18"/>
-        </w:rPr>
-        <w:t>Signature: ______________________   Name: Mr. Manav Gupta   Date: 07 August 2026</w:t>
+          <w:b w:val="false"/>
+          <w:i w:val="false"/>
+          <w:sz w:val="18"/>
+        </w:rPr>
+        <w:t xml:space="preserve">Signature: </w:t>
+      </w:r>
+      <w:r>
+        <w:rPr>
+          <w:b/>
+          <w:i/>
+          <w:sz w:val="18"/>
+        </w:rPr>
+        <w:t>/s/ Mr. Manav Gupta</w:t>
+      </w:r>
+      <w:r>
+        <w:rPr>
+          <w:b w:val="false"/>
+          <w:i/>
+          <w:sz w:val="18"/>
+        </w:rPr>
+        <w:t xml:space="preserve"> (digitally approved)   </w:t>
+      </w:r>
+      <w:r>
+        <w:rPr>
+          <w:b w:val="false"/>
+          <w:i w:val="false"/>
+          <w:sz w:val="18"/>
+        </w:rPr>
+        <w:t>Name: Mr. Manav Gupta   Date: 07 August 2026</w:t>
       </w:r>
       <w:r>
         <w:br w:type="page"/>
@@ -32655,11 +32991,35 @@
       </w:pPr>
       <w:r>
         <w:rPr>
-          <w:rFonts w:eastAsia="Times New Roman"/>
-          <w:b w:val="false"/>
-          <w:sz w:val="18"/>
-        </w:rPr>
-        <w:t>Signature: ______________________   Name: Mr. Manav Gupta   Date: 14 August 2026</w:t>
+          <w:b w:val="false"/>
+          <w:i w:val="false"/>
+          <w:sz w:val="18"/>
+        </w:rPr>
+        <w:t xml:space="preserve">Signature: </w:t>
+      </w:r>
+      <w:r>
+        <w:rPr>
+          <w:b/>
+          <w:i/>
+          <w:sz w:val="18"/>
+        </w:rPr>
+        <w:t>/s/ Mr. Manav Gupta</w:t>
+      </w:r>
+      <w:r>
+        <w:rPr>
+          <w:b w:val="false"/>
+          <w:i/>
+          <w:sz w:val="18"/>
+        </w:rPr>
+        <w:t xml:space="preserve"> (digitally approved)   </w:t>
+      </w:r>
+      <w:r>
+        <w:rPr>
+          <w:b w:val="false"/>
+          <w:i w:val="false"/>
+          <w:sz w:val="18"/>
+        </w:rPr>
+        <w:t>Name: Mr. Manav Gupta   Date: 14 August 2026</w:t>
       </w:r>
       <w:r>
         <w:br w:type="page"/>
@@ -34159,11 +34519,35 @@
       </w:pPr>
       <w:r>
         <w:rPr>
-          <w:rFonts w:eastAsia="Times New Roman"/>
-          <w:b w:val="false"/>
-          <w:sz w:val="18"/>
-        </w:rPr>
-        <w:t>Signature: ______________________   Name: Mr. Manav Gupta   Date: 21 August 2026</w:t>
+          <w:b w:val="false"/>
+          <w:i w:val="false"/>
+          <w:sz w:val="18"/>
+        </w:rPr>
+        <w:t xml:space="preserve">Signature: </w:t>
+      </w:r>
+      <w:r>
+        <w:rPr>
+          <w:b/>
+          <w:i/>
+          <w:sz w:val="18"/>
+        </w:rPr>
+        <w:t>/s/ Mr. Manav Gupta</w:t>
+      </w:r>
+      <w:r>
+        <w:rPr>
+          <w:b w:val="false"/>
+          <w:i/>
+          <w:sz w:val="18"/>
+        </w:rPr>
+        <w:t xml:space="preserve"> (digitally approved)   </w:t>
+      </w:r>
+      <w:r>
+        <w:rPr>
+          <w:b w:val="false"/>
+          <w:i w:val="false"/>
+          <w:sz w:val="18"/>
+        </w:rPr>
+        <w:t>Name: Mr. Manav Gupta   Date: 21 August 2026</w:t>
       </w:r>
       <w:r>
         <w:br w:type="page"/>
@@ -35663,11 +36047,35 @@
       </w:pPr>
       <w:r>
         <w:rPr>
-          <w:rFonts w:eastAsia="Times New Roman"/>
-          <w:b w:val="false"/>
-          <w:sz w:val="18"/>
-        </w:rPr>
-        <w:t>Signature: ______________________   Name: Mr. Manav Gupta   Date: 31 August 2026</w:t>
+          <w:b w:val="false"/>
+          <w:i w:val="false"/>
+          <w:sz w:val="18"/>
+        </w:rPr>
+        <w:t xml:space="preserve">Signature: </w:t>
+      </w:r>
+      <w:r>
+        <w:rPr>
+          <w:b/>
+          <w:i/>
+          <w:sz w:val="18"/>
+        </w:rPr>
+        <w:t>/s/ Mr. Manav Gupta</w:t>
+      </w:r>
+      <w:r>
+        <w:rPr>
+          <w:b w:val="false"/>
+          <w:i/>
+          <w:sz w:val="18"/>
+        </w:rPr>
+        <w:t xml:space="preserve"> (digitally approved)   </w:t>
+      </w:r>
+      <w:r>
+        <w:rPr>
+          <w:b w:val="false"/>
+          <w:i w:val="false"/>
+          <w:sz w:val="18"/>
+        </w:rPr>
+        <w:t>Name: Mr. Manav Gupta   Date: 31 August 2026</w:t>
       </w:r>
     </w:p>
     <w:p>
@@ -37639,11 +38047,35 @@
       </w:pPr>
       <w:r>
         <w:rPr>
-          <w:rFonts w:eastAsia="Times New Roman"/>
           <w:b/>
-          <w:sz w:val="18"/>
-        </w:rPr>
-        <w:t>Signature of Industry Mentor: ______________________   Name: Mr. Manav Gupta   Date: 31 August 2026</w:t>
+          <w:i w:val="false"/>
+          <w:sz w:val="18"/>
+        </w:rPr>
+        <w:t xml:space="preserve">Signature of Industry Mentor / Research Supervisor: </w:t>
+      </w:r>
+      <w:r>
+        <w:rPr>
+          <w:b/>
+          <w:i/>
+          <w:sz w:val="18"/>
+        </w:rPr>
+        <w:t>/s/ Mr. Manav Gupta</w:t>
+      </w:r>
+      <w:r>
+        <w:rPr>
+          <w:b w:val="false"/>
+          <w:i/>
+          <w:sz w:val="18"/>
+        </w:rPr>
+        <w:t xml:space="preserve"> (digitally approved)   </w:t>
+      </w:r>
+      <w:r>
+        <w:rPr>
+          <w:b/>
+          <w:i w:val="false"/>
+          <w:sz w:val="18"/>
+        </w:rPr>
+        <w:t>Name: Mr. Manav Gupta   Date: 31 August 2026</w:t>
       </w:r>
     </w:p>
     <w:p>

</xml_diff>